<commit_message>
Add mode=6 MBDA option as trial.
</commit_message>
<xml_diff>
--- a/doc/Change log.docx
+++ b/doc/Change log.docx
@@ -58,19 +58,10 @@
         <w:rPr>
           <w:lang w:val="en-AU"/>
         </w:rPr>
-        <w:t>20</w:t>
-      </w:r>
-      <w:r>
-        <w:rPr>
-          <w:lang w:val="en-AU"/>
-        </w:rPr>
-        <w:t>-25</w:t>
-      </w:r>
-      <w:r>
-        <w:rPr>
-          <w:lang w:val="en-AU"/>
-        </w:rPr>
-        <w:t xml:space="preserve"> May, 2026</w:t>
+        <w:t>27 May, 2026</w:t>
+      </w:r>
+      <w:r>
+        <w:t xml:space="preserve"> (branch “mbda”)</w:t>
       </w:r>
     </w:p>
     <w:p>
@@ -81,7 +72,10 @@
         </w:numPr>
       </w:pPr>
       <w:r>
-        <w:t>Main GeoPIXE</w:t>
+        <w:t>MBDA mode</w:t>
+      </w:r>
+      <w:r>
+        <w:t xml:space="preserve"> experiment</w:t>
       </w:r>
     </w:p>
     <w:p>
@@ -92,7 +86,7 @@
         </w:numPr>
       </w:pPr>
       <w:r>
-        <w:t>Da_evt</w:t>
+        <w:t>The idea here is to do a kind of MPDA but where the variation in yields is ignored, targeted mostly to track variation in Background shape. This has some advantages:</w:t>
       </w:r>
     </w:p>
     <w:p>
@@ -103,7 +97,44 @@
         </w:numPr>
       </w:pPr>
       <w:r>
-        <w:t>Take care if log=0. Only use gprint and fix ‘help, output=’ lines.</w:t>
+        <w:t xml:space="preserve">Do not need to do </w:t>
+      </w:r>
+      <w:r>
+        <w:t>“Correct</w:t>
+      </w:r>
+      <w:r>
+        <w:t>”</w:t>
+      </w:r>
+      <w:r>
+        <w:t xml:space="preserve"> iterations in </w:t>
+      </w:r>
+      <w:r>
+        <w:rPr>
+          <w:i/>
+          <w:iCs/>
+        </w:rPr>
+        <w:t>CorrectYield</w:t>
+      </w:r>
+      <w:r>
+        <w:t xml:space="preserve"> to refine </w:t>
+      </w:r>
+      <w:r>
+        <w:t xml:space="preserve">element </w:t>
+      </w:r>
+      <w:r>
+        <w:t xml:space="preserve">maps </w:t>
+      </w:r>
+      <w:r>
+        <w:t>in order to</w:t>
+      </w:r>
+      <w:r>
+        <w:t xml:space="preserve"> mak</w:t>
+      </w:r>
+      <w:r>
+        <w:t>e</w:t>
+      </w:r>
+      <w:r>
+        <w:t xml:space="preserve"> Phase maps.</w:t>
       </w:r>
     </w:p>
     <w:p>
@@ -114,33 +145,18 @@
         </w:numPr>
       </w:pPr>
       <w:r>
-        <w:t>Especially in MPDA mode.</w:t>
-      </w:r>
-    </w:p>
-    <w:p>
-      <w:pPr>
-        <w:numPr>
-          <w:ilvl w:val="1"/>
+        <w:t>Hence, hot regions keep their initial concentrations values.</w:t>
+      </w:r>
+    </w:p>
+    <w:p>
+      <w:pPr>
+        <w:numPr>
+          <w:ilvl w:val="2"/>
           <w:numId w:val="78"/>
         </w:numPr>
       </w:pPr>
       <w:r>
-        <w:t>Read_da</w:t>
-      </w:r>
-      <w:r>
-        <w:t xml:space="preserve">, </w:t>
-      </w:r>
-      <w:r>
-        <w:t>Read_maia, throttle_q, read_buffer, geopixe_defaults</w:t>
-      </w:r>
-      <w:r>
-        <w:t xml:space="preserve">, </w:t>
-      </w:r>
-      <w:r>
-        <w:t>startup, read_mpdam</w:t>
-      </w:r>
-      <w:r>
-        <w:t>, unstringify</w:t>
+        <w:t>Can identify “endmembers” simply as regions with extreme composition and background shape.</w:t>
       </w:r>
     </w:p>
     <w:p>
@@ -151,40 +167,46 @@
         </w:numPr>
       </w:pPr>
       <w:r>
-        <w:t>Use ‘gprint’ instead of ‘print’, so errors get catch’ed.</w:t>
-      </w:r>
-    </w:p>
-    <w:p>
-      <w:pPr>
-        <w:numPr>
-          <w:ilvl w:val="1"/>
+        <w:t>Project onto these endmembers so that pixel spectra backgrounds essentially become phase weighted averages of these endmember background shapes.</w:t>
+      </w:r>
+    </w:p>
+    <w:p>
+      <w:pPr>
+        <w:numPr>
+          <w:ilvl w:val="2"/>
           <w:numId w:val="78"/>
         </w:numPr>
       </w:pPr>
       <w:r>
-        <w:t>Parallel_worker routines</w:t>
-      </w:r>
-    </w:p>
-    <w:p>
-      <w:pPr>
-        <w:numPr>
-          <w:ilvl w:val="2"/>
+        <w:t>Possible to automate endmember selection (perhaps) and make a Wizard</w:t>
+      </w:r>
+      <w:r>
+        <w:t xml:space="preserve"> aimed at tracking background shape and subtraction for better element images, especially for weak traces on background</w:t>
+      </w:r>
+      <w:r>
+        <w:t>.</w:t>
+      </w:r>
+    </w:p>
+    <w:p>
+      <w:pPr>
+        <w:numPr>
+          <w:ilvl w:val="1"/>
           <w:numId w:val="78"/>
         </w:numPr>
       </w:pPr>
       <w:r>
-        <w:t>Use ‘gprintf’ instead of ‘printf’, so errors get catch’ed.</w:t>
-      </w:r>
-    </w:p>
-    <w:p>
-      <w:pPr>
-        <w:numPr>
-          <w:ilvl w:val="1"/>
+        <w:t>Disadvantages:</w:t>
+      </w:r>
+    </w:p>
+    <w:p>
+      <w:pPr>
+        <w:numPr>
+          <w:ilvl w:val="2"/>
           <w:numId w:val="78"/>
         </w:numPr>
       </w:pPr>
       <w:r>
-        <w:t>Read_geopixe_image</w:t>
+        <w:t>Because it’s not tracking variation of yields between phases, it does not correct concentrations for composition variation across the image area.</w:t>
       </w:r>
     </w:p>
     <w:p>
@@ -195,29 +217,29 @@
         </w:numPr>
       </w:pPr>
       <w:r>
-        <w:t>Use ‘gprintf’ instead of ‘printf’, so errors get catch’ed.</w:t>
-      </w:r>
-    </w:p>
-    <w:p>
-      <w:pPr>
-        <w:numPr>
-          <w:ilvl w:val="1"/>
+        <w:t>The spectrum reconstructions (overlays) in the extracted spectra are not accurate.</w:t>
+      </w:r>
+    </w:p>
+    <w:p>
+      <w:pPr>
+        <w:numPr>
+          <w:ilvl w:val="2"/>
           <w:numId w:val="78"/>
         </w:numPr>
       </w:pPr>
       <w:r>
-        <w:t>Gprint</w:t>
-      </w:r>
-    </w:p>
-    <w:p>
-      <w:pPr>
-        <w:numPr>
-          <w:ilvl w:val="2"/>
+        <w:t>While MPDA is more difficult to get right (because hot regions that might be targeted as “endmembers” for background tracking, as above for MBDA, change composition as “Correct” refinement is done), it will give better image concentrations and spectra overlays in the end.</w:t>
+      </w:r>
+    </w:p>
+    <w:p>
+      <w:pPr>
+        <w:numPr>
+          <w:ilvl w:val="1"/>
           <w:numId w:val="78"/>
         </w:numPr>
       </w:pPr>
       <w:r>
-        <w:t>Add an error catch, to ignore print errors (e.g. in background process in cluster mode, when logging is disabled).</w:t>
+        <w:t>Alternatives:</w:t>
       </w:r>
     </w:p>
     <w:p>
@@ -228,49 +250,7 @@
         </w:numPr>
       </w:pPr>
       <w:r>
-        <w:t>Just count args that are not null</w:t>
-      </w:r>
-      <w:r>
-        <w:t xml:space="preserve"> to set ‘narg’ for case.</w:t>
-      </w:r>
-    </w:p>
-    <w:p>
-      <w:pPr>
-        <w:numPr>
-          <w:ilvl w:val="1"/>
-          <w:numId w:val="78"/>
-        </w:numPr>
-      </w:pPr>
-      <w:r>
-        <w:t>Gprintf, lun</w:t>
-      </w:r>
-    </w:p>
-    <w:p>
-      <w:pPr>
-        <w:numPr>
-          <w:ilvl w:val="2"/>
-          <w:numId w:val="78"/>
-        </w:numPr>
-      </w:pPr>
-      <w:r>
-        <w:t>Calls ’gprint</w:t>
-      </w:r>
-      <w:r>
-        <w:t>,</w:t>
-      </w:r>
-      <w:r>
-        <w:t xml:space="preserve"> output=lun’.</w:t>
-      </w:r>
-    </w:p>
-    <w:p>
-      <w:pPr>
-        <w:numPr>
-          <w:ilvl w:val="1"/>
-          <w:numId w:val="78"/>
-        </w:numPr>
-      </w:pPr>
-      <w:r>
-        <w:t>Version 9.0a</w:t>
+        <w:t>Perhaps using MPDA is still better, even though the endmembers based on initial hot regions may change in later iterations. That changes endmember proportions (phase maps) but still keeps a large proportion due to the terms that drive background shape.</w:t>
       </w:r>
     </w:p>
     <w:p>
@@ -281,6 +261,604 @@
         </w:numPr>
       </w:pPr>
       <w:r>
+        <w:t>Main GeoPIXE</w:t>
+      </w:r>
+    </w:p>
+    <w:p>
+      <w:pPr>
+        <w:numPr>
+          <w:ilvl w:val="1"/>
+          <w:numId w:val="78"/>
+        </w:numPr>
+      </w:pPr>
+      <w:r>
+        <w:t>Evt</w:t>
+      </w:r>
+    </w:p>
+    <w:p>
+      <w:pPr>
+        <w:numPr>
+          <w:ilvl w:val="2"/>
+          <w:numId w:val="78"/>
+        </w:numPr>
+      </w:pPr>
+      <w:r>
+        <w:t>Add projection mode MBDA (mode=6) for MBDA.</w:t>
+      </w:r>
+    </w:p>
+    <w:p>
+      <w:pPr>
+        <w:numPr>
+          <w:ilvl w:val="1"/>
+          <w:numId w:val="78"/>
+        </w:numPr>
+      </w:pPr>
+      <w:r>
+        <w:t>Evt_fix_output (new)</w:t>
+      </w:r>
+    </w:p>
+    <w:p>
+      <w:pPr>
+        <w:numPr>
+          <w:ilvl w:val="2"/>
+          <w:numId w:val="78"/>
+        </w:numPr>
+      </w:pPr>
+      <w:r>
+        <w:t>Fix output filename</w:t>
+      </w:r>
+    </w:p>
+    <w:p>
+      <w:pPr>
+        <w:numPr>
+          <w:ilvl w:val="1"/>
+          <w:numId w:val="78"/>
+        </w:numPr>
+      </w:pPr>
+      <w:r>
+        <w:t>Read_da</w:t>
+      </w:r>
+    </w:p>
+    <w:p>
+      <w:pPr>
+        <w:numPr>
+          <w:ilvl w:val="2"/>
+          <w:numId w:val="78"/>
+        </w:numPr>
+      </w:pPr>
+      <w:r>
+        <w:t xml:space="preserve">Add “back_only” keyword, which gets returned if a </w:t>
+      </w:r>
+      <w:r>
+        <w:t>/</w:t>
+      </w:r>
+      <w:r>
+        <w:t>back_only matrix (MBDA mode) is read from</w:t>
+      </w:r>
+      <w:r>
+        <w:t xml:space="preserve"> a stringified ‘file’ argument.</w:t>
+      </w:r>
+    </w:p>
+    <w:p>
+      <w:pPr>
+        <w:numPr>
+          <w:ilvl w:val="2"/>
+          <w:numId w:val="78"/>
+        </w:numPr>
+      </w:pPr>
+      <w:r>
+        <w:t>Set all returned yields equal to the ‘original’ yields.</w:t>
+      </w:r>
+    </w:p>
+    <w:p>
+      <w:pPr>
+        <w:numPr>
+          <w:ilvl w:val="1"/>
+          <w:numId w:val="78"/>
+        </w:numPr>
+      </w:pPr>
+      <w:r>
+        <w:t>check</w:t>
+      </w:r>
+      <w:r>
+        <w:t>_mpdam</w:t>
+      </w:r>
+    </w:p>
+    <w:p>
+      <w:pPr>
+        <w:numPr>
+          <w:ilvl w:val="2"/>
+          <w:numId w:val="78"/>
+        </w:numPr>
+      </w:pPr>
+      <w:r>
+        <w:t>Add “back_only” keyword input, which sets MBDA mode.</w:t>
+      </w:r>
+    </w:p>
+    <w:p>
+      <w:pPr>
+        <w:numPr>
+          <w:ilvl w:val="2"/>
+          <w:numId w:val="78"/>
+        </w:numPr>
+      </w:pPr>
+      <w:r>
+        <w:t>Passes this to ‘read_mpdam’.</w:t>
+      </w:r>
+    </w:p>
+    <w:p>
+      <w:pPr>
+        <w:numPr>
+          <w:ilvl w:val="1"/>
+          <w:numId w:val="78"/>
+        </w:numPr>
+      </w:pPr>
+      <w:r>
+        <w:t>Read_mpdam</w:t>
+      </w:r>
+    </w:p>
+    <w:p>
+      <w:pPr>
+        <w:numPr>
+          <w:ilvl w:val="2"/>
+          <w:numId w:val="78"/>
+        </w:numPr>
+      </w:pPr>
+      <w:r>
+        <w:t>Add “back_only” keyword input, which sets MBDA mode.</w:t>
+      </w:r>
+    </w:p>
+    <w:p>
+      <w:pPr>
+        <w:numPr>
+          <w:ilvl w:val="2"/>
+          <w:numId w:val="78"/>
+        </w:numPr>
+      </w:pPr>
+      <w:r>
+        <w:t>This adds “back_only” key to returned struct (later passed to ‘read_da’ as the stringified arg, which comes from ‘evt_start’ to ‘da_evt’ as ‘</w:t>
+      </w:r>
+      <w:r>
+        <w:t>mpdam_string</w:t>
+      </w:r>
+      <w:r>
+        <w:t>’).</w:t>
+      </w:r>
+    </w:p>
+    <w:p>
+      <w:pPr>
+        <w:numPr>
+          <w:ilvl w:val="1"/>
+          <w:numId w:val="78"/>
+        </w:numPr>
+      </w:pPr>
+      <w:r>
+        <w:t>Evt_start</w:t>
+      </w:r>
+    </w:p>
+    <w:p>
+      <w:pPr>
+        <w:numPr>
+          <w:ilvl w:val="2"/>
+          <w:numId w:val="78"/>
+        </w:numPr>
+      </w:pPr>
+      <w:r>
+        <w:t>Set ‘back_only’ passed to ‘check_mpdam’ based on mode=6.</w:t>
+      </w:r>
+    </w:p>
+    <w:p>
+      <w:pPr>
+        <w:numPr>
+          <w:ilvl w:val="2"/>
+          <w:numId w:val="78"/>
+        </w:numPr>
+      </w:pPr>
+      <w:r>
+        <w:t>Reorder lines to set ‘mode’ before call to check_mpdam.</w:t>
+      </w:r>
+    </w:p>
+    <w:p>
+      <w:pPr>
+        <w:numPr>
+          <w:ilvl w:val="1"/>
+          <w:numId w:val="78"/>
+        </w:numPr>
+      </w:pPr>
+      <w:r>
+        <w:t>Da_evt</w:t>
+      </w:r>
+    </w:p>
+    <w:p>
+      <w:pPr>
+        <w:numPr>
+          <w:ilvl w:val="2"/>
+          <w:numId w:val="78"/>
+        </w:numPr>
+      </w:pPr>
+      <w:r>
+        <w:lastRenderedPageBreak/>
+        <w:t>Gets ‘back_only’ returned from ‘read_da’ for a stringified ‘mpdam_string’, which is used to set mode=6 for MBDA mode.</w:t>
+      </w:r>
+    </w:p>
+    <w:p>
+      <w:pPr>
+        <w:numPr>
+          <w:ilvl w:val="1"/>
+          <w:numId w:val="78"/>
+        </w:numPr>
+      </w:pPr>
+      <w:r>
+        <w:t>Image_routines</w:t>
+      </w:r>
+    </w:p>
+    <w:p>
+      <w:pPr>
+        <w:numPr>
+          <w:ilvl w:val="2"/>
+          <w:numId w:val="78"/>
+        </w:numPr>
+      </w:pPr>
+      <w:r>
+        <w:t>Analyze_image</w:t>
+      </w:r>
+    </w:p>
+    <w:p>
+      <w:pPr>
+        <w:numPr>
+          <w:ilvl w:val="3"/>
+          <w:numId w:val="78"/>
+        </w:numPr>
+      </w:pPr>
+      <w:r>
+        <w:t>If need to fill in (*p).pda in image struct:</w:t>
+      </w:r>
+    </w:p>
+    <w:p>
+      <w:pPr>
+        <w:numPr>
+          <w:ilvl w:val="3"/>
+          <w:numId w:val="78"/>
+        </w:numPr>
+      </w:pPr>
+      <w:r>
+        <w:t>Pass ‘back_only=(*p).mode eq 6)’ to ‘read_da’ to set MBDA mode.</w:t>
+      </w:r>
+    </w:p>
+    <w:p>
+      <w:pPr>
+        <w:numPr>
+          <w:ilvl w:val="1"/>
+          <w:numId w:val="78"/>
+        </w:numPr>
+      </w:pPr>
+      <w:r>
+        <w:t>Image_eventcb</w:t>
+      </w:r>
+    </w:p>
+    <w:p>
+      <w:pPr>
+        <w:numPr>
+          <w:ilvl w:val="2"/>
+          <w:numId w:val="78"/>
+        </w:numPr>
+      </w:pPr>
+      <w:r>
+        <w:t>Image_Load_DA_spectrum_refit</w:t>
+      </w:r>
+    </w:p>
+    <w:p>
+      <w:pPr>
+        <w:numPr>
+          <w:ilvl w:val="3"/>
+          <w:numId w:val="78"/>
+        </w:numPr>
+      </w:pPr>
+      <w:r>
+        <w:t>To fill in (*p).pda in image struct:</w:t>
+      </w:r>
+    </w:p>
+    <w:p>
+      <w:pPr>
+        <w:numPr>
+          <w:ilvl w:val="3"/>
+          <w:numId w:val="78"/>
+        </w:numPr>
+      </w:pPr>
+      <w:r>
+        <w:t>Pass ‘back_only=(*p).mode eq 6)’ to ‘read_da’ to set MBDA mode.</w:t>
+      </w:r>
+    </w:p>
+    <w:p>
+      <w:pPr>
+        <w:numPr>
+          <w:ilvl w:val="1"/>
+          <w:numId w:val="78"/>
+        </w:numPr>
+      </w:pPr>
+      <w:r>
+        <w:t>Image_detail</w:t>
+      </w:r>
+    </w:p>
+    <w:p>
+      <w:pPr>
+        <w:numPr>
+          <w:ilvl w:val="2"/>
+          <w:numId w:val="78"/>
+        </w:numPr>
+      </w:pPr>
+      <w:r>
+        <w:t>Cater for reporting new ‘mode’ 6 for MBDA.</w:t>
+      </w:r>
+    </w:p>
+    <w:p>
+      <w:pPr>
+        <w:numPr>
+          <w:ilvl w:val="1"/>
+          <w:numId w:val="78"/>
+        </w:numPr>
+      </w:pPr>
+      <w:r>
+        <w:t>Version 9.</w:t>
+      </w:r>
+      <w:r>
+        <w:t>1</w:t>
+      </w:r>
+      <w:r>
+        <w:t>.</w:t>
+      </w:r>
+    </w:p>
+    <w:p>
+      <w:pPr>
+        <w:pStyle w:val="Heading3"/>
+        <w:rPr>
+          <w:lang w:val="en-AU"/>
+        </w:rPr>
+      </w:pPr>
+    </w:p>
+    <w:p/>
+    <w:p/>
+    <w:p/>
+    <w:p>
+      <w:pPr>
+        <w:pStyle w:val="Heading3"/>
+        <w:rPr>
+          <w:lang w:val="en-AU"/>
+        </w:rPr>
+      </w:pPr>
+      <w:r>
+        <w:rPr>
+          <w:lang w:val="en-AU"/>
+        </w:rPr>
+        <w:t>20</w:t>
+      </w:r>
+      <w:r>
+        <w:rPr>
+          <w:lang w:val="en-AU"/>
+        </w:rPr>
+        <w:t>-25</w:t>
+      </w:r>
+      <w:r>
+        <w:rPr>
+          <w:lang w:val="en-AU"/>
+        </w:rPr>
+        <w:t xml:space="preserve"> May, 2026</w:t>
+      </w:r>
+      <w:r>
+        <w:rPr>
+          <w:lang w:val="en-AU"/>
+        </w:rPr>
+        <w:t xml:space="preserve"> (branch “main”)</w:t>
+      </w:r>
+    </w:p>
+    <w:p>
+      <w:pPr>
+        <w:numPr>
+          <w:ilvl w:val="0"/>
+          <w:numId w:val="85"/>
+        </w:numPr>
+      </w:pPr>
+      <w:r>
+        <w:t>Main GeoPIXE</w:t>
+      </w:r>
+    </w:p>
+    <w:p>
+      <w:pPr>
+        <w:numPr>
+          <w:ilvl w:val="1"/>
+          <w:numId w:val="85"/>
+        </w:numPr>
+      </w:pPr>
+      <w:r>
+        <w:t>Da_evt</w:t>
+      </w:r>
+    </w:p>
+    <w:p>
+      <w:pPr>
+        <w:numPr>
+          <w:ilvl w:val="2"/>
+          <w:numId w:val="85"/>
+        </w:numPr>
+      </w:pPr>
+      <w:r>
+        <w:t>Take care if log=0. Only use gprint and fix ‘help, output=’ lines.</w:t>
+      </w:r>
+    </w:p>
+    <w:p>
+      <w:pPr>
+        <w:numPr>
+          <w:ilvl w:val="2"/>
+          <w:numId w:val="85"/>
+        </w:numPr>
+      </w:pPr>
+      <w:r>
+        <w:t>Especially in MPDA mode.</w:t>
+      </w:r>
+    </w:p>
+    <w:p>
+      <w:pPr>
+        <w:numPr>
+          <w:ilvl w:val="1"/>
+          <w:numId w:val="85"/>
+        </w:numPr>
+      </w:pPr>
+      <w:r>
+        <w:t>Read_da</w:t>
+      </w:r>
+      <w:r>
+        <w:t xml:space="preserve">, </w:t>
+      </w:r>
+      <w:r>
+        <w:t>Read_maia, throttle_q, read_buffer, geopixe_defaults</w:t>
+      </w:r>
+      <w:r>
+        <w:t xml:space="preserve">, </w:t>
+      </w:r>
+      <w:r>
+        <w:t>startup, read_mpdam</w:t>
+      </w:r>
+      <w:r>
+        <w:t>, unstringify</w:t>
+      </w:r>
+    </w:p>
+    <w:p>
+      <w:pPr>
+        <w:numPr>
+          <w:ilvl w:val="2"/>
+          <w:numId w:val="85"/>
+        </w:numPr>
+      </w:pPr>
+      <w:r>
+        <w:t>Use ‘gprint’ instead of ‘print’, so errors get catch’ed.</w:t>
+      </w:r>
+    </w:p>
+    <w:p>
+      <w:pPr>
+        <w:numPr>
+          <w:ilvl w:val="1"/>
+          <w:numId w:val="85"/>
+        </w:numPr>
+      </w:pPr>
+      <w:r>
+        <w:t>Parallel_worker routines</w:t>
+      </w:r>
+    </w:p>
+    <w:p>
+      <w:pPr>
+        <w:numPr>
+          <w:ilvl w:val="2"/>
+          <w:numId w:val="85"/>
+        </w:numPr>
+      </w:pPr>
+      <w:r>
+        <w:t>Use ‘gprintf’ instead of ‘printf’, so errors get catch’ed.</w:t>
+      </w:r>
+    </w:p>
+    <w:p>
+      <w:pPr>
+        <w:numPr>
+          <w:ilvl w:val="1"/>
+          <w:numId w:val="85"/>
+        </w:numPr>
+      </w:pPr>
+      <w:r>
+        <w:t>Read_geopixe_image</w:t>
+      </w:r>
+    </w:p>
+    <w:p>
+      <w:pPr>
+        <w:numPr>
+          <w:ilvl w:val="2"/>
+          <w:numId w:val="85"/>
+        </w:numPr>
+      </w:pPr>
+      <w:r>
+        <w:t>Use ‘gprintf’ instead of ‘printf’, so errors get catch’ed.</w:t>
+      </w:r>
+    </w:p>
+    <w:p>
+      <w:pPr>
+        <w:numPr>
+          <w:ilvl w:val="1"/>
+          <w:numId w:val="85"/>
+        </w:numPr>
+      </w:pPr>
+      <w:r>
+        <w:t>Gprint</w:t>
+      </w:r>
+    </w:p>
+    <w:p>
+      <w:pPr>
+        <w:numPr>
+          <w:ilvl w:val="2"/>
+          <w:numId w:val="85"/>
+        </w:numPr>
+      </w:pPr>
+      <w:r>
+        <w:t>Add an error catch, to ignore print errors (e.g. in background process in cluster mode, when logging is disabled).</w:t>
+      </w:r>
+    </w:p>
+    <w:p>
+      <w:pPr>
+        <w:numPr>
+          <w:ilvl w:val="2"/>
+          <w:numId w:val="85"/>
+        </w:numPr>
+      </w:pPr>
+      <w:r>
+        <w:t>Just count args that are not null</w:t>
+      </w:r>
+      <w:r>
+        <w:t xml:space="preserve"> to set ‘narg’ for case.</w:t>
+      </w:r>
+    </w:p>
+    <w:p>
+      <w:pPr>
+        <w:numPr>
+          <w:ilvl w:val="1"/>
+          <w:numId w:val="85"/>
+        </w:numPr>
+      </w:pPr>
+      <w:r>
+        <w:t>Gprintf, lun</w:t>
+      </w:r>
+    </w:p>
+    <w:p>
+      <w:pPr>
+        <w:numPr>
+          <w:ilvl w:val="2"/>
+          <w:numId w:val="85"/>
+        </w:numPr>
+      </w:pPr>
+      <w:r>
+        <w:t>Calls ’gprint</w:t>
+      </w:r>
+      <w:r>
+        <w:t>,</w:t>
+      </w:r>
+      <w:r>
+        <w:t xml:space="preserve"> output=lun’.</w:t>
+      </w:r>
+    </w:p>
+    <w:p>
+      <w:pPr>
+        <w:numPr>
+          <w:ilvl w:val="1"/>
+          <w:numId w:val="85"/>
+        </w:numPr>
+      </w:pPr>
+      <w:r>
+        <w:t>Version 9.0a</w:t>
+      </w:r>
+    </w:p>
+    <w:p>
+      <w:pPr>
+        <w:numPr>
+          <w:ilvl w:val="0"/>
+          <w:numId w:val="85"/>
+        </w:numPr>
+      </w:pPr>
+      <w:r>
         <w:t>Maia device</w:t>
       </w:r>
     </w:p>
@@ -288,7 +866,7 @@
       <w:pPr>
         <w:numPr>
           <w:ilvl w:val="1"/>
-          <w:numId w:val="78"/>
+          <w:numId w:val="85"/>
         </w:numPr>
       </w:pPr>
       <w:r>
@@ -299,21 +877,18 @@
       <w:pPr>
         <w:numPr>
           <w:ilvl w:val="0"/>
-          <w:numId w:val="78"/>
-        </w:numPr>
-      </w:pPr>
-      <w:r>
-        <w:t>FalconX</w:t>
-      </w:r>
-      <w:r>
-        <w:t xml:space="preserve"> device</w:t>
-      </w:r>
-    </w:p>
-    <w:p>
-      <w:pPr>
-        <w:numPr>
-          <w:ilvl w:val="1"/>
-          <w:numId w:val="78"/>
+          <w:numId w:val="85"/>
+        </w:numPr>
+      </w:pPr>
+      <w:r>
+        <w:t>FalconX device</w:t>
+      </w:r>
+    </w:p>
+    <w:p>
+      <w:pPr>
+        <w:numPr>
+          <w:ilvl w:val="1"/>
+          <w:numId w:val="85"/>
         </w:numPr>
       </w:pPr>
       <w:r>
@@ -324,7 +899,7 @@
       <w:pPr>
         <w:numPr>
           <w:ilvl w:val="0"/>
-          <w:numId w:val="78"/>
+          <w:numId w:val="85"/>
         </w:numPr>
         <w:rPr>
           <w:b/>
@@ -352,7 +927,7 @@
       <w:pPr>
         <w:numPr>
           <w:ilvl w:val="1"/>
-          <w:numId w:val="78"/>
+          <w:numId w:val="85"/>
         </w:numPr>
       </w:pPr>
       <w:r>
@@ -372,7 +947,7 @@
       <w:pPr>
         <w:numPr>
           <w:ilvl w:val="1"/>
-          <w:numId w:val="78"/>
+          <w:numId w:val="85"/>
         </w:numPr>
       </w:pPr>
       <w:r>
@@ -404,7 +979,7 @@
       <w:pPr>
         <w:numPr>
           <w:ilvl w:val="1"/>
-          <w:numId w:val="78"/>
+          <w:numId w:val="85"/>
         </w:numPr>
       </w:pPr>
       <w:r>
@@ -424,7 +999,7 @@
       <w:pPr>
         <w:numPr>
           <w:ilvl w:val="1"/>
-          <w:numId w:val="78"/>
+          <w:numId w:val="85"/>
         </w:numPr>
       </w:pPr>
       <w:r>
@@ -444,10 +1019,11 @@
       <w:pPr>
         <w:numPr>
           <w:ilvl w:val="1"/>
-          <w:numId w:val="78"/>
-        </w:numPr>
-      </w:pPr>
-      <w:r>
+          <w:numId w:val="85"/>
+        </w:numPr>
+      </w:pPr>
+      <w:r>
+        <w:lastRenderedPageBreak/>
         <w:t>Disable logging to test that all is now working without error.</w:t>
       </w:r>
     </w:p>
@@ -455,7 +1031,7 @@
       <w:pPr>
         <w:numPr>
           <w:ilvl w:val="1"/>
-          <w:numId w:val="78"/>
+          <w:numId w:val="85"/>
         </w:numPr>
         <w:rPr>
           <w:highlight w:val="yellow"/>
@@ -472,7 +1048,7 @@
       <w:pPr>
         <w:numPr>
           <w:ilvl w:val="2"/>
-          <w:numId w:val="78"/>
+          <w:numId w:val="85"/>
         </w:numPr>
       </w:pPr>
       <w:r>
@@ -489,7 +1065,7 @@
       <w:pPr>
         <w:numPr>
           <w:ilvl w:val="2"/>
-          <w:numId w:val="78"/>
+          <w:numId w:val="85"/>
         </w:numPr>
       </w:pPr>
       <w:r>
@@ -618,7 +1194,6 @@
         </w:numPr>
       </w:pPr>
       <w:r>
-        <w:lastRenderedPageBreak/>
         <w:t>Evt_start</w:t>
       </w:r>
     </w:p>
@@ -1103,6 +1678,7 @@
         <w:rPr>
           <w:highlight w:val="yellow"/>
         </w:rPr>
+        <w:lastRenderedPageBreak/>
         <w:t>Version 9.0</w:t>
       </w:r>
     </w:p>
@@ -1228,7 +1804,6 @@
         </w:numPr>
       </w:pPr>
       <w:r>
-        <w:lastRenderedPageBreak/>
         <w:t>Define</w:t>
       </w:r>
     </w:p>
@@ -1729,6 +2304,7 @@
         </w:numPr>
       </w:pPr>
       <w:r>
+        <w:lastRenderedPageBreak/>
         <w:t>Make the logging to files in cluster mode optional.</w:t>
       </w:r>
     </w:p>
@@ -1871,7 +2447,6 @@
         </w:numPr>
       </w:pPr>
       <w:r>
-        <w:lastRenderedPageBreak/>
         <w:t>Geopixe_execute</w:t>
       </w:r>
     </w:p>
@@ -2347,6 +2922,7 @@
         </w:numPr>
       </w:pPr>
       <w:r>
+        <w:lastRenderedPageBreak/>
         <w:t>Wizard_depth</w:t>
       </w:r>
     </w:p>
@@ -2483,7 +3059,6 @@
         </w:numPr>
       </w:pPr>
       <w:r>
-        <w:lastRenderedPageBreak/>
         <w:t>Occasional X=0 when near X maximum turn-around</w:t>
       </w:r>
     </w:p>
@@ -3238,6 +3813,7 @@
         </w:numPr>
       </w:pPr>
       <w:r>
+        <w:lastRenderedPageBreak/>
         <w:t>A new parameter ‘sxy’ (in common ‘</w:t>
       </w:r>
       <w:r>
@@ -3388,7 +3964,6 @@
         </w:numPr>
       </w:pPr>
       <w:r>
-        <w:lastRenderedPageBreak/>
         <w:t>Add code to veto tiny periodic table, only for Linux, due to display bug.</w:t>
       </w:r>
     </w:p>
@@ -3830,6 +4405,7 @@
         </w:numPr>
       </w:pPr>
       <w:r>
+        <w:lastRenderedPageBreak/>
         <w:t>Version, 8.9</w:t>
       </w:r>
       <w:r>
@@ -3984,7 +4560,6 @@
         </w:numPr>
       </w:pPr>
       <w:r>
-        <w:lastRenderedPageBreak/>
         <w:t xml:space="preserve">Has a new keyword /refine, to </w:t>
       </w:r>
       <w:r>
@@ -4311,6 +4886,7 @@
         </w:numPr>
       </w:pPr>
       <w:r>
+        <w:lastRenderedPageBreak/>
         <w:t>wizard_standards_callback_image_done</w:t>
       </w:r>
     </w:p>
@@ -4440,7 +5016,6 @@
         <w:rPr>
           <w:lang w:val="en-AU"/>
         </w:rPr>
-        <w:lastRenderedPageBreak/>
         <w:t>24</w:t>
       </w:r>
       <w:r>
@@ -4920,6 +5495,7 @@
         </w:numPr>
       </w:pPr>
       <w:r>
+        <w:lastRenderedPageBreak/>
         <w:t>New embedded HTML browser in GeoPIXE to display help docs.</w:t>
       </w:r>
       <w:r>
@@ -5072,7 +5648,6 @@
         </w:numPr>
       </w:pPr>
       <w:r>
-        <w:lastRenderedPageBreak/>
         <w:t xml:space="preserve">Middle mouse button </w:t>
       </w:r>
       <w:r>
@@ -5480,6 +6055,7 @@
         <w:rPr>
           <w:lang w:val="en-AU"/>
         </w:rPr>
+        <w:lastRenderedPageBreak/>
         <w:t>20</w:t>
       </w:r>
       <w:r>
@@ -5672,7 +6248,6 @@
         </w:numPr>
       </w:pPr>
       <w:r>
-        <w:lastRenderedPageBreak/>
         <w:t>Corr</w:t>
       </w:r>
     </w:p>
@@ -6199,6 +6774,7 @@
         <w:rPr>
           <w:lang w:val="en-AU"/>
         </w:rPr>
+        <w:lastRenderedPageBreak/>
         <w:t>28</w:t>
       </w:r>
       <w:r>
@@ -6376,7 +6952,6 @@
         <w:rPr>
           <w:lang w:val="en-AU"/>
         </w:rPr>
-        <w:lastRenderedPageBreak/>
         <w:t>21</w:t>
       </w:r>
       <w:r>
@@ -6849,6 +7424,7 @@
         </w:numPr>
       </w:pPr>
       <w:r>
+        <w:lastRenderedPageBreak/>
         <w:t>Scan_dir_evt</w:t>
       </w:r>
     </w:p>
@@ -6998,7 +7574,6 @@
         </w:numPr>
       </w:pPr>
       <w:r>
-        <w:lastRenderedPageBreak/>
         <w:t>Send a new action (‘sort-setup’) to EVT when a template sort DAI is opened to set initial settings, which a user may modify before starting processing. Do not send the default/template pdai settings later when processing loop is running.</w:t>
       </w:r>
     </w:p>
@@ -7366,6 +7941,7 @@
         </w:numPr>
       </w:pPr>
       <w:r>
+        <w:lastRenderedPageBreak/>
         <w:t>Wizard_window_count</w:t>
       </w:r>
     </w:p>
@@ -7492,7 +8068,6 @@
         </w:numPr>
       </w:pPr>
       <w:r>
-        <w:lastRenderedPageBreak/>
         <w:t>This is done in the event routine, so no need for a loop check in a callback routine.</w:t>
       </w:r>
     </w:p>
@@ -7917,6 +8492,7 @@
         <w:rPr>
           <w:lang w:val="en-AU"/>
         </w:rPr>
+        <w:lastRenderedPageBreak/>
         <w:t>8</w:t>
       </w:r>
       <w:r>
@@ -8075,7 +8651,6 @@
         </w:numPr>
       </w:pPr>
       <w:r>
-        <w:lastRenderedPageBreak/>
         <w:t>‘image-process’ Notify event now uses ‘image_do_operations’, to apply incoming ops coming from the “Get” button in ‘image_process’.</w:t>
       </w:r>
     </w:p>
@@ -8477,6 +9052,7 @@
         </w:numPr>
       </w:pPr>
       <w:r>
+        <w:lastRenderedPageBreak/>
         <w:t>Use a case insensitive compare between operation retrieved from image file and the operations list in ‘image_process’.</w:t>
       </w:r>
     </w:p>
@@ -8567,7 +9143,6 @@
         </w:numPr>
       </w:pPr>
       <w:r>
-        <w:lastRenderedPageBreak/>
         <w:t>Added ‘dai_dir’ keyword to be able to select a different dir for output DAI files.</w:t>
       </w:r>
     </w:p>
@@ -9007,6 +9582,7 @@
         </w:numPr>
       </w:pPr>
       <w:r>
+        <w:lastRenderedPageBreak/>
         <w:t>Use ‘set_widget_text’ to set CUTs file widget, even if blank/none supplied.</w:t>
       </w:r>
     </w:p>
@@ -9109,7 +9685,6 @@
         </w:numPr>
       </w:pPr>
       <w:r>
-        <w:lastRenderedPageBreak/>
         <w:t xml:space="preserve">“Find” used to just show </w:t>
       </w:r>
       <w:r>
@@ -9546,6 +10121,7 @@
         <w:rPr>
           <w:lang w:val="en-AU"/>
         </w:rPr>
+        <w:lastRenderedPageBreak/>
         <w:t>22 July, 2025</w:t>
       </w:r>
     </w:p>
@@ -9664,7 +10240,6 @@
         </w:numPr>
       </w:pPr>
       <w:r>
-        <w:lastRenderedPageBreak/>
         <w:t>APS Regolith-82 (APS List)</w:t>
       </w:r>
     </w:p>
@@ -10040,6 +10615,7 @@
         </w:numPr>
       </w:pPr>
       <w:r>
+        <w:lastRenderedPageBreak/>
         <w:t>Add “c/s” as a special element as alternative to “Rate”.</w:t>
       </w:r>
     </w:p>
@@ -10131,7 +10707,6 @@
         <w:rPr>
           <w:lang w:val="en-AU"/>
         </w:rPr>
-        <w:lastRenderedPageBreak/>
         <w:t>10 June, 2025</w:t>
       </w:r>
     </w:p>
@@ -10570,6 +11145,7 @@
         </w:numPr>
       </w:pPr>
       <w:r>
+        <w:lastRenderedPageBreak/>
         <w:t>Detect ‘options.ShowALLregions’ true and loop through all regions (if found) and use ‘plot_mark’ for each.</w:t>
       </w:r>
     </w:p>
@@ -10653,7 +11229,6 @@
         </w:numPr>
       </w:pPr>
       <w:r>
-        <w:lastRenderedPageBreak/>
         <w:t>build_ebel_data</w:t>
       </w:r>
       <w:r>
@@ -11109,6 +11684,7 @@
         </w:numPr>
       </w:pPr>
       <w:r>
+        <w:lastRenderedPageBreak/>
         <w:t>Set_image_view</w:t>
       </w:r>
     </w:p>
@@ -11178,7 +11754,6 @@
         </w:numPr>
       </w:pPr>
       <w:r>
-        <w:lastRenderedPageBreak/>
         <w:t>Problem arose if manual enter parameters into layer setup (not restore from LCM).</w:t>
       </w:r>
     </w:p>
@@ -11592,6 +12167,7 @@
         </w:numPr>
       </w:pPr>
       <w:r>
+        <w:lastRenderedPageBreak/>
         <w:t>Reads P06 tree of NXS files into spectra.</w:t>
       </w:r>
     </w:p>
@@ -11683,7 +12259,6 @@
         <w:rPr>
           <w:lang w:val="en-AU"/>
         </w:rPr>
-        <w:lastRenderedPageBreak/>
         <w:t>12 Feb, 2025</w:t>
       </w:r>
     </w:p>
@@ -11979,6 +12554,7 @@
         </w:numPr>
       </w:pPr>
       <w:r>
+        <w:lastRenderedPageBreak/>
         <w:t>Make detector Layout behave similarly, inheriting the path for the detector file.</w:t>
       </w:r>
     </w:p>
@@ -12037,7 +12613,6 @@
         </w:numPr>
       </w:pPr>
       <w:r>
-        <w:lastRenderedPageBreak/>
         <w:t>On running GeoPIXE, these SAV files get loaded and write over newer versions of many routines that have been compiled (into GeoPIXE.sav) since the plugin. This of course a really bad thing, and confusing for debugging.</w:t>
       </w:r>
     </w:p>
@@ -12464,6 +13039,7 @@
         </w:numPr>
       </w:pPr>
       <w:r>
+        <w:lastRenderedPageBreak/>
         <w:t>Firstly, I forgot I was in “develop” when upgrading the Workspace in IDL 9.1.</w:t>
       </w:r>
     </w:p>
@@ -12522,7 +13098,6 @@
         <w:rPr>
           <w:lang w:val="en-AU"/>
         </w:rPr>
-        <w:lastRenderedPageBreak/>
         <w:t>3 Dec, 2024</w:t>
       </w:r>
     </w:p>
@@ -13012,6 +13587,7 @@
         </w:numPr>
       </w:pPr>
       <w:r>
+        <w:lastRenderedPageBreak/>
         <w:t>Fortunately, these parameters do not get used - they are for info only. However, the ’compare_fit’ routine flag</w:t>
       </w:r>
       <w:r>
@@ -13073,7 +13649,6 @@
         </w:numPr>
       </w:pPr>
       <w:r>
-        <w:lastRenderedPageBreak/>
         <w:t>But do these cIn lines inherit normal In rel-ints, rather than from beam lines?</w:t>
       </w:r>
     </w:p>
@@ -13618,6 +14193,7 @@
         </w:numPr>
       </w:pPr>
       <w:r>
+        <w:lastRenderedPageBreak/>
         <w:t>Remove arg ‘sec_fl’ passed to geo_array_yield.</w:t>
       </w:r>
     </w:p>
@@ -13693,7 +14269,6 @@
         </w:numPr>
       </w:pPr>
       <w:r>
-        <w:lastRenderedPageBreak/>
         <w:t xml:space="preserve">Simply prints out any inconsistencies found </w:t>
       </w:r>
       <w:r>
@@ -14099,6 +14674,7 @@
         <w:rPr>
           <w:lang w:val="en-AU"/>
         </w:rPr>
+        <w:lastRenderedPageBreak/>
         <w:t>4 June, 2024</w:t>
       </w:r>
     </w:p>
@@ -14176,7 +14752,6 @@
         </w:numPr>
       </w:pPr>
       <w:r>
-        <w:lastRenderedPageBreak/>
         <w:t>NSLS MARS Ge device</w:t>
       </w:r>
     </w:p>
@@ -14635,6 +15210,7 @@
         </w:numPr>
       </w:pPr>
       <w:r>
+        <w:lastRenderedPageBreak/>
         <w:t>We don’t want to set no_block=1 on xmanager</w:t>
       </w:r>
       <w:r>
@@ -14724,7 +15300,6 @@
         </w:numPr>
       </w:pPr>
       <w:r>
-        <w:lastRenderedPageBreak/>
         <w:t xml:space="preserve">i.e. It was found that you could use modal=0, floating=1 on the top base widget and </w:t>
       </w:r>
       <w:r>
@@ -15170,6 +15745,7 @@
         </w:numPr>
       </w:pPr>
       <w:r>
+        <w:lastRenderedPageBreak/>
         <w:t xml:space="preserve">Set </w:t>
       </w:r>
       <w:r>
@@ -15263,7 +15839,6 @@
         </w:numPr>
       </w:pPr>
       <w:r>
-        <w:lastRenderedPageBreak/>
         <w:t>‘load-source’ now handles cases of 6:lab, 7:pink beam.</w:t>
       </w:r>
     </w:p>
@@ -15735,6 +16310,7 @@
         </w:numPr>
       </w:pPr>
       <w:r>
+        <w:lastRenderedPageBreak/>
         <w:t>Maia_launch_initial, maia_launch_read_enable, maia_launch_read_groups</w:t>
       </w:r>
     </w:p>
@@ -15816,7 +16392,6 @@
         </w:numPr>
       </w:pPr>
       <w:r>
-        <w:lastRenderedPageBreak/>
         <w:t>Spawn_blog_parameters</w:t>
       </w:r>
     </w:p>
@@ -16296,6 +16871,7 @@
         </w:numPr>
       </w:pPr>
       <w:r>
+        <w:lastRenderedPageBreak/>
         <w:t>These include:</w:t>
       </w:r>
     </w:p>
@@ -16362,7 +16938,6 @@
         </w:numPr>
       </w:pPr>
       <w:r>
-        <w:lastRenderedPageBreak/>
         <w:t>Bayes.</w:t>
       </w:r>
     </w:p>
@@ -16841,6 +17416,7 @@
         </w:numPr>
       </w:pPr>
       <w:r>
+        <w:lastRenderedPageBreak/>
         <w:t xml:space="preserve">Some get renamed: mm_scan_list </w:t>
       </w:r>
       <w:r>
@@ -16958,7 +17534,6 @@
         </w:numPr>
       </w:pPr>
       <w:r>
-        <w:lastRenderedPageBreak/>
         <w:t>Use ‘builder’ (pops up index selection) to select which classes to build, which creates “build.spro” (note: this will be in “geopixe” for runtime execution and “main” for IDLDE execution).</w:t>
       </w:r>
       <w:r>
@@ -18492,6 +19067,92 @@
     </w:lvl>
   </w:abstractNum>
   <w:abstractNum w:abstractNumId="8" w15:restartNumberingAfterBreak="0">
+    <w:nsid w:val="08EC6709"/>
+    <w:multiLevelType w:val="hybridMultilevel"/>
+    <w:tmpl w:val="214CC6C4"/>
+    <w:lvl w:ilvl="0" w:tplc="FFFFFFFF">
+      <w:start w:val="1"/>
+      <w:numFmt w:val="decimal"/>
+      <w:lvlText w:val="%1."/>
+      <w:lvlJc w:val="left"/>
+      <w:pPr>
+        <w:ind w:left="720" w:hanging="360"/>
+      </w:pPr>
+    </w:lvl>
+    <w:lvl w:ilvl="1" w:tplc="FFFFFFFF">
+      <w:start w:val="1"/>
+      <w:numFmt w:val="lowerLetter"/>
+      <w:lvlText w:val="%2."/>
+      <w:lvlJc w:val="left"/>
+      <w:pPr>
+        <w:ind w:left="1440" w:hanging="360"/>
+      </w:pPr>
+    </w:lvl>
+    <w:lvl w:ilvl="2" w:tplc="FFFFFFFF">
+      <w:start w:val="1"/>
+      <w:numFmt w:val="lowerRoman"/>
+      <w:lvlText w:val="%3."/>
+      <w:lvlJc w:val="right"/>
+      <w:pPr>
+        <w:ind w:left="2160" w:hanging="180"/>
+      </w:pPr>
+    </w:lvl>
+    <w:lvl w:ilvl="3" w:tplc="FFFFFFFF">
+      <w:start w:val="1"/>
+      <w:numFmt w:val="decimal"/>
+      <w:lvlText w:val="%4."/>
+      <w:lvlJc w:val="left"/>
+      <w:pPr>
+        <w:ind w:left="2880" w:hanging="360"/>
+      </w:pPr>
+    </w:lvl>
+    <w:lvl w:ilvl="4" w:tplc="FFFFFFFF">
+      <w:start w:val="1"/>
+      <w:numFmt w:val="lowerLetter"/>
+      <w:lvlText w:val="%5."/>
+      <w:lvlJc w:val="left"/>
+      <w:pPr>
+        <w:ind w:left="3600" w:hanging="360"/>
+      </w:pPr>
+    </w:lvl>
+    <w:lvl w:ilvl="5" w:tplc="FFFFFFFF">
+      <w:start w:val="1"/>
+      <w:numFmt w:val="lowerRoman"/>
+      <w:lvlText w:val="%6."/>
+      <w:lvlJc w:val="right"/>
+      <w:pPr>
+        <w:ind w:left="4320" w:hanging="180"/>
+      </w:pPr>
+    </w:lvl>
+    <w:lvl w:ilvl="6" w:tplc="FFFFFFFF" w:tentative="1">
+      <w:start w:val="1"/>
+      <w:numFmt w:val="decimal"/>
+      <w:lvlText w:val="%7."/>
+      <w:lvlJc w:val="left"/>
+      <w:pPr>
+        <w:ind w:left="5040" w:hanging="360"/>
+      </w:pPr>
+    </w:lvl>
+    <w:lvl w:ilvl="7" w:tplc="FFFFFFFF" w:tentative="1">
+      <w:start w:val="1"/>
+      <w:numFmt w:val="lowerLetter"/>
+      <w:lvlText w:val="%8."/>
+      <w:lvlJc w:val="left"/>
+      <w:pPr>
+        <w:ind w:left="5760" w:hanging="360"/>
+      </w:pPr>
+    </w:lvl>
+    <w:lvl w:ilvl="8" w:tplc="FFFFFFFF" w:tentative="1">
+      <w:start w:val="1"/>
+      <w:numFmt w:val="lowerRoman"/>
+      <w:lvlText w:val="%9."/>
+      <w:lvlJc w:val="right"/>
+      <w:pPr>
+        <w:ind w:left="6480" w:hanging="180"/>
+      </w:pPr>
+    </w:lvl>
+  </w:abstractNum>
+  <w:abstractNum w:abstractNumId="9" w15:restartNumberingAfterBreak="0">
     <w:nsid w:val="0E0D360F"/>
     <w:multiLevelType w:val="hybridMultilevel"/>
     <w:tmpl w:val="214CC6C4"/>
@@ -18577,7 +19238,7 @@
       </w:pPr>
     </w:lvl>
   </w:abstractNum>
-  <w:abstractNum w:abstractNumId="9" w15:restartNumberingAfterBreak="0">
+  <w:abstractNum w:abstractNumId="10" w15:restartNumberingAfterBreak="0">
     <w:nsid w:val="0FA726CE"/>
     <w:multiLevelType w:val="hybridMultilevel"/>
     <w:tmpl w:val="214CC6C4"/>
@@ -18663,7 +19324,7 @@
       </w:pPr>
     </w:lvl>
   </w:abstractNum>
-  <w:abstractNum w:abstractNumId="10" w15:restartNumberingAfterBreak="0">
+  <w:abstractNum w:abstractNumId="11" w15:restartNumberingAfterBreak="0">
     <w:nsid w:val="1446692A"/>
     <w:multiLevelType w:val="hybridMultilevel"/>
     <w:tmpl w:val="214CC6C4"/>
@@ -18749,7 +19410,7 @@
       </w:pPr>
     </w:lvl>
   </w:abstractNum>
-  <w:abstractNum w:abstractNumId="11" w15:restartNumberingAfterBreak="0">
+  <w:abstractNum w:abstractNumId="12" w15:restartNumberingAfterBreak="0">
     <w:nsid w:val="1565078C"/>
     <w:multiLevelType w:val="hybridMultilevel"/>
     <w:tmpl w:val="214CC6C4"/>
@@ -18835,7 +19496,7 @@
       </w:pPr>
     </w:lvl>
   </w:abstractNum>
-  <w:abstractNum w:abstractNumId="12" w15:restartNumberingAfterBreak="0">
+  <w:abstractNum w:abstractNumId="13" w15:restartNumberingAfterBreak="0">
     <w:nsid w:val="18D02687"/>
     <w:multiLevelType w:val="hybridMultilevel"/>
     <w:tmpl w:val="214CC6C4"/>
@@ -18921,7 +19582,7 @@
       </w:pPr>
     </w:lvl>
   </w:abstractNum>
-  <w:abstractNum w:abstractNumId="13" w15:restartNumberingAfterBreak="0">
+  <w:abstractNum w:abstractNumId="14" w15:restartNumberingAfterBreak="0">
     <w:nsid w:val="1BA42179"/>
     <w:multiLevelType w:val="hybridMultilevel"/>
     <w:tmpl w:val="214CC6C4"/>
@@ -19007,7 +19668,7 @@
       </w:pPr>
     </w:lvl>
   </w:abstractNum>
-  <w:abstractNum w:abstractNumId="14" w15:restartNumberingAfterBreak="0">
+  <w:abstractNum w:abstractNumId="15" w15:restartNumberingAfterBreak="0">
     <w:nsid w:val="1BBB7985"/>
     <w:multiLevelType w:val="hybridMultilevel"/>
     <w:tmpl w:val="214CC6C4"/>
@@ -19093,7 +19754,7 @@
       </w:pPr>
     </w:lvl>
   </w:abstractNum>
-  <w:abstractNum w:abstractNumId="15" w15:restartNumberingAfterBreak="0">
+  <w:abstractNum w:abstractNumId="16" w15:restartNumberingAfterBreak="0">
     <w:nsid w:val="1CA6531C"/>
     <w:multiLevelType w:val="hybridMultilevel"/>
     <w:tmpl w:val="214CC6C4"/>
@@ -19179,7 +19840,7 @@
       </w:pPr>
     </w:lvl>
   </w:abstractNum>
-  <w:abstractNum w:abstractNumId="16" w15:restartNumberingAfterBreak="0">
+  <w:abstractNum w:abstractNumId="17" w15:restartNumberingAfterBreak="0">
     <w:nsid w:val="1EC639EF"/>
     <w:multiLevelType w:val="hybridMultilevel"/>
     <w:tmpl w:val="214CC6C4"/>
@@ -19265,7 +19926,7 @@
       </w:pPr>
     </w:lvl>
   </w:abstractNum>
-  <w:abstractNum w:abstractNumId="17" w15:restartNumberingAfterBreak="0">
+  <w:abstractNum w:abstractNumId="18" w15:restartNumberingAfterBreak="0">
     <w:nsid w:val="20760EC2"/>
     <w:multiLevelType w:val="hybridMultilevel"/>
     <w:tmpl w:val="214CC6C4"/>
@@ -19351,7 +20012,7 @@
       </w:pPr>
     </w:lvl>
   </w:abstractNum>
-  <w:abstractNum w:abstractNumId="18" w15:restartNumberingAfterBreak="0">
+  <w:abstractNum w:abstractNumId="19" w15:restartNumberingAfterBreak="0">
     <w:nsid w:val="21225858"/>
     <w:multiLevelType w:val="hybridMultilevel"/>
     <w:tmpl w:val="214CC6C4"/>
@@ -19437,7 +20098,7 @@
       </w:pPr>
     </w:lvl>
   </w:abstractNum>
-  <w:abstractNum w:abstractNumId="19" w15:restartNumberingAfterBreak="0">
+  <w:abstractNum w:abstractNumId="20" w15:restartNumberingAfterBreak="0">
     <w:nsid w:val="229F5551"/>
     <w:multiLevelType w:val="hybridMultilevel"/>
     <w:tmpl w:val="214CC6C4"/>
@@ -19523,7 +20184,7 @@
       </w:pPr>
     </w:lvl>
   </w:abstractNum>
-  <w:abstractNum w:abstractNumId="20" w15:restartNumberingAfterBreak="0">
+  <w:abstractNum w:abstractNumId="21" w15:restartNumberingAfterBreak="0">
     <w:nsid w:val="23163984"/>
     <w:multiLevelType w:val="hybridMultilevel"/>
     <w:tmpl w:val="214CC6C4"/>
@@ -19609,7 +20270,7 @@
       </w:pPr>
     </w:lvl>
   </w:abstractNum>
-  <w:abstractNum w:abstractNumId="21" w15:restartNumberingAfterBreak="0">
+  <w:abstractNum w:abstractNumId="22" w15:restartNumberingAfterBreak="0">
     <w:nsid w:val="24A86A6C"/>
     <w:multiLevelType w:val="hybridMultilevel"/>
     <w:tmpl w:val="214CC6C4"/>
@@ -19695,7 +20356,7 @@
       </w:pPr>
     </w:lvl>
   </w:abstractNum>
-  <w:abstractNum w:abstractNumId="22" w15:restartNumberingAfterBreak="0">
+  <w:abstractNum w:abstractNumId="23" w15:restartNumberingAfterBreak="0">
     <w:nsid w:val="275B156F"/>
     <w:multiLevelType w:val="hybridMultilevel"/>
     <w:tmpl w:val="214CC6C4"/>
@@ -19781,7 +20442,7 @@
       </w:pPr>
     </w:lvl>
   </w:abstractNum>
-  <w:abstractNum w:abstractNumId="23" w15:restartNumberingAfterBreak="0">
+  <w:abstractNum w:abstractNumId="24" w15:restartNumberingAfterBreak="0">
     <w:nsid w:val="28090D24"/>
     <w:multiLevelType w:val="hybridMultilevel"/>
     <w:tmpl w:val="214CC6C4"/>
@@ -19867,7 +20528,7 @@
       </w:pPr>
     </w:lvl>
   </w:abstractNum>
-  <w:abstractNum w:abstractNumId="24" w15:restartNumberingAfterBreak="0">
+  <w:abstractNum w:abstractNumId="25" w15:restartNumberingAfterBreak="0">
     <w:nsid w:val="2BBE5C5D"/>
     <w:multiLevelType w:val="hybridMultilevel"/>
     <w:tmpl w:val="214CC6C4"/>
@@ -19953,7 +20614,7 @@
       </w:pPr>
     </w:lvl>
   </w:abstractNum>
-  <w:abstractNum w:abstractNumId="25" w15:restartNumberingAfterBreak="0">
+  <w:abstractNum w:abstractNumId="26" w15:restartNumberingAfterBreak="0">
     <w:nsid w:val="2ED42603"/>
     <w:multiLevelType w:val="hybridMultilevel"/>
     <w:tmpl w:val="214CC6C4"/>
@@ -20039,7 +20700,7 @@
       </w:pPr>
     </w:lvl>
   </w:abstractNum>
-  <w:abstractNum w:abstractNumId="26" w15:restartNumberingAfterBreak="0">
+  <w:abstractNum w:abstractNumId="27" w15:restartNumberingAfterBreak="0">
     <w:nsid w:val="2F545F49"/>
     <w:multiLevelType w:val="hybridMultilevel"/>
     <w:tmpl w:val="214CC6C4"/>
@@ -20125,7 +20786,7 @@
       </w:pPr>
     </w:lvl>
   </w:abstractNum>
-  <w:abstractNum w:abstractNumId="27" w15:restartNumberingAfterBreak="0">
+  <w:abstractNum w:abstractNumId="28" w15:restartNumberingAfterBreak="0">
     <w:nsid w:val="2F731835"/>
     <w:multiLevelType w:val="hybridMultilevel"/>
     <w:tmpl w:val="214CC6C4"/>
@@ -20211,7 +20872,7 @@
       </w:pPr>
     </w:lvl>
   </w:abstractNum>
-  <w:abstractNum w:abstractNumId="28" w15:restartNumberingAfterBreak="0">
+  <w:abstractNum w:abstractNumId="29" w15:restartNumberingAfterBreak="0">
     <w:nsid w:val="32326CBE"/>
     <w:multiLevelType w:val="hybridMultilevel"/>
     <w:tmpl w:val="214CC6C4"/>
@@ -20297,7 +20958,7 @@
       </w:pPr>
     </w:lvl>
   </w:abstractNum>
-  <w:abstractNum w:abstractNumId="29" w15:restartNumberingAfterBreak="0">
+  <w:abstractNum w:abstractNumId="30" w15:restartNumberingAfterBreak="0">
     <w:nsid w:val="32A949EB"/>
     <w:multiLevelType w:val="hybridMultilevel"/>
     <w:tmpl w:val="214CC6C4"/>
@@ -20383,7 +21044,7 @@
       </w:pPr>
     </w:lvl>
   </w:abstractNum>
-  <w:abstractNum w:abstractNumId="30" w15:restartNumberingAfterBreak="0">
+  <w:abstractNum w:abstractNumId="31" w15:restartNumberingAfterBreak="0">
     <w:nsid w:val="33231170"/>
     <w:multiLevelType w:val="hybridMultilevel"/>
     <w:tmpl w:val="214CC6C4"/>
@@ -20469,7 +21130,7 @@
       </w:pPr>
     </w:lvl>
   </w:abstractNum>
-  <w:abstractNum w:abstractNumId="31" w15:restartNumberingAfterBreak="0">
+  <w:abstractNum w:abstractNumId="32" w15:restartNumberingAfterBreak="0">
     <w:nsid w:val="335B6E8D"/>
     <w:multiLevelType w:val="hybridMultilevel"/>
     <w:tmpl w:val="214CC6C4"/>
@@ -20555,7 +21216,7 @@
       </w:pPr>
     </w:lvl>
   </w:abstractNum>
-  <w:abstractNum w:abstractNumId="32" w15:restartNumberingAfterBreak="0">
+  <w:abstractNum w:abstractNumId="33" w15:restartNumberingAfterBreak="0">
     <w:nsid w:val="355B2568"/>
     <w:multiLevelType w:val="hybridMultilevel"/>
     <w:tmpl w:val="214CC6C4"/>
@@ -20641,7 +21302,7 @@
       </w:pPr>
     </w:lvl>
   </w:abstractNum>
-  <w:abstractNum w:abstractNumId="33" w15:restartNumberingAfterBreak="0">
+  <w:abstractNum w:abstractNumId="34" w15:restartNumberingAfterBreak="0">
     <w:nsid w:val="356645B8"/>
     <w:multiLevelType w:val="hybridMultilevel"/>
     <w:tmpl w:val="214CC6C4"/>
@@ -20727,7 +21388,7 @@
       </w:pPr>
     </w:lvl>
   </w:abstractNum>
-  <w:abstractNum w:abstractNumId="34" w15:restartNumberingAfterBreak="0">
+  <w:abstractNum w:abstractNumId="35" w15:restartNumberingAfterBreak="0">
     <w:nsid w:val="35B806D1"/>
     <w:multiLevelType w:val="hybridMultilevel"/>
     <w:tmpl w:val="214CC6C4"/>
@@ -20813,7 +21474,7 @@
       </w:pPr>
     </w:lvl>
   </w:abstractNum>
-  <w:abstractNum w:abstractNumId="35" w15:restartNumberingAfterBreak="0">
+  <w:abstractNum w:abstractNumId="36" w15:restartNumberingAfterBreak="0">
     <w:nsid w:val="37C0055A"/>
     <w:multiLevelType w:val="hybridMultilevel"/>
     <w:tmpl w:val="214CC6C4"/>
@@ -20899,7 +21560,7 @@
       </w:pPr>
     </w:lvl>
   </w:abstractNum>
-  <w:abstractNum w:abstractNumId="36" w15:restartNumberingAfterBreak="0">
+  <w:abstractNum w:abstractNumId="37" w15:restartNumberingAfterBreak="0">
     <w:nsid w:val="383C1F2F"/>
     <w:multiLevelType w:val="hybridMultilevel"/>
     <w:tmpl w:val="214CC6C4"/>
@@ -20985,7 +21646,7 @@
       </w:pPr>
     </w:lvl>
   </w:abstractNum>
-  <w:abstractNum w:abstractNumId="37" w15:restartNumberingAfterBreak="0">
+  <w:abstractNum w:abstractNumId="38" w15:restartNumberingAfterBreak="0">
     <w:nsid w:val="38677977"/>
     <w:multiLevelType w:val="hybridMultilevel"/>
     <w:tmpl w:val="214CC6C4"/>
@@ -21071,7 +21732,7 @@
       </w:pPr>
     </w:lvl>
   </w:abstractNum>
-  <w:abstractNum w:abstractNumId="38" w15:restartNumberingAfterBreak="0">
+  <w:abstractNum w:abstractNumId="39" w15:restartNumberingAfterBreak="0">
     <w:nsid w:val="39E017C7"/>
     <w:multiLevelType w:val="hybridMultilevel"/>
     <w:tmpl w:val="214CC6C4"/>
@@ -21157,7 +21818,7 @@
       </w:pPr>
     </w:lvl>
   </w:abstractNum>
-  <w:abstractNum w:abstractNumId="39" w15:restartNumberingAfterBreak="0">
+  <w:abstractNum w:abstractNumId="40" w15:restartNumberingAfterBreak="0">
     <w:nsid w:val="3A906D54"/>
     <w:multiLevelType w:val="hybridMultilevel"/>
     <w:tmpl w:val="214CC6C4"/>
@@ -21243,7 +21904,7 @@
       </w:pPr>
     </w:lvl>
   </w:abstractNum>
-  <w:abstractNum w:abstractNumId="40" w15:restartNumberingAfterBreak="0">
+  <w:abstractNum w:abstractNumId="41" w15:restartNumberingAfterBreak="0">
     <w:nsid w:val="3D360724"/>
     <w:multiLevelType w:val="hybridMultilevel"/>
     <w:tmpl w:val="214CC6C4"/>
@@ -21329,7 +21990,7 @@
       </w:pPr>
     </w:lvl>
   </w:abstractNum>
-  <w:abstractNum w:abstractNumId="41" w15:restartNumberingAfterBreak="0">
+  <w:abstractNum w:abstractNumId="42" w15:restartNumberingAfterBreak="0">
     <w:nsid w:val="3DF10524"/>
     <w:multiLevelType w:val="hybridMultilevel"/>
     <w:tmpl w:val="214CC6C4"/>
@@ -21415,7 +22076,7 @@
       </w:pPr>
     </w:lvl>
   </w:abstractNum>
-  <w:abstractNum w:abstractNumId="42" w15:restartNumberingAfterBreak="0">
+  <w:abstractNum w:abstractNumId="43" w15:restartNumberingAfterBreak="0">
     <w:nsid w:val="3F097101"/>
     <w:multiLevelType w:val="hybridMultilevel"/>
     <w:tmpl w:val="214CC6C4"/>
@@ -21501,7 +22162,7 @@
       </w:pPr>
     </w:lvl>
   </w:abstractNum>
-  <w:abstractNum w:abstractNumId="43" w15:restartNumberingAfterBreak="0">
+  <w:abstractNum w:abstractNumId="44" w15:restartNumberingAfterBreak="0">
     <w:nsid w:val="41A638B2"/>
     <w:multiLevelType w:val="hybridMultilevel"/>
     <w:tmpl w:val="214CC6C4"/>
@@ -21587,7 +22248,7 @@
       </w:pPr>
     </w:lvl>
   </w:abstractNum>
-  <w:abstractNum w:abstractNumId="44" w15:restartNumberingAfterBreak="0">
+  <w:abstractNum w:abstractNumId="45" w15:restartNumberingAfterBreak="0">
     <w:nsid w:val="420D41AB"/>
     <w:multiLevelType w:val="hybridMultilevel"/>
     <w:tmpl w:val="214CC6C4"/>
@@ -21673,7 +22334,7 @@
       </w:pPr>
     </w:lvl>
   </w:abstractNum>
-  <w:abstractNum w:abstractNumId="45" w15:restartNumberingAfterBreak="0">
+  <w:abstractNum w:abstractNumId="46" w15:restartNumberingAfterBreak="0">
     <w:nsid w:val="436129C1"/>
     <w:multiLevelType w:val="hybridMultilevel"/>
     <w:tmpl w:val="214CC6C4"/>
@@ -21759,7 +22420,7 @@
       </w:pPr>
     </w:lvl>
   </w:abstractNum>
-  <w:abstractNum w:abstractNumId="46" w15:restartNumberingAfterBreak="0">
+  <w:abstractNum w:abstractNumId="47" w15:restartNumberingAfterBreak="0">
     <w:nsid w:val="438D310E"/>
     <w:multiLevelType w:val="hybridMultilevel"/>
     <w:tmpl w:val="3DFEBE78"/>
@@ -21845,7 +22506,7 @@
       </w:pPr>
     </w:lvl>
   </w:abstractNum>
-  <w:abstractNum w:abstractNumId="47" w15:restartNumberingAfterBreak="0">
+  <w:abstractNum w:abstractNumId="48" w15:restartNumberingAfterBreak="0">
     <w:nsid w:val="45F80AA2"/>
     <w:multiLevelType w:val="hybridMultilevel"/>
     <w:tmpl w:val="214CC6C4"/>
@@ -21931,7 +22592,7 @@
       </w:pPr>
     </w:lvl>
   </w:abstractNum>
-  <w:abstractNum w:abstractNumId="48" w15:restartNumberingAfterBreak="0">
+  <w:abstractNum w:abstractNumId="49" w15:restartNumberingAfterBreak="0">
     <w:nsid w:val="46D104B0"/>
     <w:multiLevelType w:val="hybridMultilevel"/>
     <w:tmpl w:val="214CC6C4"/>
@@ -22017,7 +22678,7 @@
       </w:pPr>
     </w:lvl>
   </w:abstractNum>
-  <w:abstractNum w:abstractNumId="49" w15:restartNumberingAfterBreak="0">
+  <w:abstractNum w:abstractNumId="50" w15:restartNumberingAfterBreak="0">
     <w:nsid w:val="47C63F90"/>
     <w:multiLevelType w:val="hybridMultilevel"/>
     <w:tmpl w:val="214CC6C4"/>
@@ -22103,7 +22764,7 @@
       </w:pPr>
     </w:lvl>
   </w:abstractNum>
-  <w:abstractNum w:abstractNumId="50" w15:restartNumberingAfterBreak="0">
+  <w:abstractNum w:abstractNumId="51" w15:restartNumberingAfterBreak="0">
     <w:nsid w:val="48424B8D"/>
     <w:multiLevelType w:val="hybridMultilevel"/>
     <w:tmpl w:val="214CC6C4"/>
@@ -22189,7 +22850,7 @@
       </w:pPr>
     </w:lvl>
   </w:abstractNum>
-  <w:abstractNum w:abstractNumId="51" w15:restartNumberingAfterBreak="0">
+  <w:abstractNum w:abstractNumId="52" w15:restartNumberingAfterBreak="0">
     <w:nsid w:val="48E719F4"/>
     <w:multiLevelType w:val="hybridMultilevel"/>
     <w:tmpl w:val="214CC6C4"/>
@@ -22275,7 +22936,7 @@
       </w:pPr>
     </w:lvl>
   </w:abstractNum>
-  <w:abstractNum w:abstractNumId="52" w15:restartNumberingAfterBreak="0">
+  <w:abstractNum w:abstractNumId="53" w15:restartNumberingAfterBreak="0">
     <w:nsid w:val="4A276C6F"/>
     <w:multiLevelType w:val="hybridMultilevel"/>
     <w:tmpl w:val="214CC6C4"/>
@@ -22361,7 +23022,7 @@
       </w:pPr>
     </w:lvl>
   </w:abstractNum>
-  <w:abstractNum w:abstractNumId="53" w15:restartNumberingAfterBreak="0">
+  <w:abstractNum w:abstractNumId="54" w15:restartNumberingAfterBreak="0">
     <w:nsid w:val="4ACD66FA"/>
     <w:multiLevelType w:val="hybridMultilevel"/>
     <w:tmpl w:val="214CC6C4"/>
@@ -22447,7 +23108,7 @@
       </w:pPr>
     </w:lvl>
   </w:abstractNum>
-  <w:abstractNum w:abstractNumId="54" w15:restartNumberingAfterBreak="0">
+  <w:abstractNum w:abstractNumId="55" w15:restartNumberingAfterBreak="0">
     <w:nsid w:val="4B205F99"/>
     <w:multiLevelType w:val="hybridMultilevel"/>
     <w:tmpl w:val="214CC6C4"/>
@@ -22533,7 +23194,7 @@
       </w:pPr>
     </w:lvl>
   </w:abstractNum>
-  <w:abstractNum w:abstractNumId="55" w15:restartNumberingAfterBreak="0">
+  <w:abstractNum w:abstractNumId="56" w15:restartNumberingAfterBreak="0">
     <w:nsid w:val="4B7F04E2"/>
     <w:multiLevelType w:val="hybridMultilevel"/>
     <w:tmpl w:val="214CC6C4"/>
@@ -22619,7 +23280,7 @@
       </w:pPr>
     </w:lvl>
   </w:abstractNum>
-  <w:abstractNum w:abstractNumId="56" w15:restartNumberingAfterBreak="0">
+  <w:abstractNum w:abstractNumId="57" w15:restartNumberingAfterBreak="0">
     <w:nsid w:val="4D9A4F4C"/>
     <w:multiLevelType w:val="hybridMultilevel"/>
     <w:tmpl w:val="214CC6C4"/>
@@ -22705,7 +23366,7 @@
       </w:pPr>
     </w:lvl>
   </w:abstractNum>
-  <w:abstractNum w:abstractNumId="57" w15:restartNumberingAfterBreak="0">
+  <w:abstractNum w:abstractNumId="58" w15:restartNumberingAfterBreak="0">
     <w:nsid w:val="4FB81408"/>
     <w:multiLevelType w:val="hybridMultilevel"/>
     <w:tmpl w:val="214CC6C4"/>
@@ -22791,7 +23452,7 @@
       </w:pPr>
     </w:lvl>
   </w:abstractNum>
-  <w:abstractNum w:abstractNumId="58" w15:restartNumberingAfterBreak="0">
+  <w:abstractNum w:abstractNumId="59" w15:restartNumberingAfterBreak="0">
     <w:nsid w:val="56833A85"/>
     <w:multiLevelType w:val="hybridMultilevel"/>
     <w:tmpl w:val="214CC6C4"/>
@@ -22877,7 +23538,7 @@
       </w:pPr>
     </w:lvl>
   </w:abstractNum>
-  <w:abstractNum w:abstractNumId="59" w15:restartNumberingAfterBreak="0">
+  <w:abstractNum w:abstractNumId="60" w15:restartNumberingAfterBreak="0">
     <w:nsid w:val="56C643E7"/>
     <w:multiLevelType w:val="hybridMultilevel"/>
     <w:tmpl w:val="214CC6C4"/>
@@ -22963,7 +23624,7 @@
       </w:pPr>
     </w:lvl>
   </w:abstractNum>
-  <w:abstractNum w:abstractNumId="60" w15:restartNumberingAfterBreak="0">
+  <w:abstractNum w:abstractNumId="61" w15:restartNumberingAfterBreak="0">
     <w:nsid w:val="59654531"/>
     <w:multiLevelType w:val="hybridMultilevel"/>
     <w:tmpl w:val="214CC6C4"/>
@@ -23049,7 +23710,7 @@
       </w:pPr>
     </w:lvl>
   </w:abstractNum>
-  <w:abstractNum w:abstractNumId="61" w15:restartNumberingAfterBreak="0">
+  <w:abstractNum w:abstractNumId="62" w15:restartNumberingAfterBreak="0">
     <w:nsid w:val="59CA6D97"/>
     <w:multiLevelType w:val="hybridMultilevel"/>
     <w:tmpl w:val="214CC6C4"/>
@@ -23135,7 +23796,7 @@
       </w:pPr>
     </w:lvl>
   </w:abstractNum>
-  <w:abstractNum w:abstractNumId="62" w15:restartNumberingAfterBreak="0">
+  <w:abstractNum w:abstractNumId="63" w15:restartNumberingAfterBreak="0">
     <w:nsid w:val="60085356"/>
     <w:multiLevelType w:val="hybridMultilevel"/>
     <w:tmpl w:val="214CC6C4"/>
@@ -23221,7 +23882,7 @@
       </w:pPr>
     </w:lvl>
   </w:abstractNum>
-  <w:abstractNum w:abstractNumId="63" w15:restartNumberingAfterBreak="0">
+  <w:abstractNum w:abstractNumId="64" w15:restartNumberingAfterBreak="0">
     <w:nsid w:val="61513B38"/>
     <w:multiLevelType w:val="hybridMultilevel"/>
     <w:tmpl w:val="4D926568"/>
@@ -23307,7 +23968,7 @@
       </w:pPr>
     </w:lvl>
   </w:abstractNum>
-  <w:abstractNum w:abstractNumId="64" w15:restartNumberingAfterBreak="0">
+  <w:abstractNum w:abstractNumId="65" w15:restartNumberingAfterBreak="0">
     <w:nsid w:val="62686DE9"/>
     <w:multiLevelType w:val="hybridMultilevel"/>
     <w:tmpl w:val="214CC6C4"/>
@@ -23393,7 +24054,7 @@
       </w:pPr>
     </w:lvl>
   </w:abstractNum>
-  <w:abstractNum w:abstractNumId="65" w15:restartNumberingAfterBreak="0">
+  <w:abstractNum w:abstractNumId="66" w15:restartNumberingAfterBreak="0">
     <w:nsid w:val="64B53F9E"/>
     <w:multiLevelType w:val="hybridMultilevel"/>
     <w:tmpl w:val="214CC6C4"/>
@@ -23479,7 +24140,7 @@
       </w:pPr>
     </w:lvl>
   </w:abstractNum>
-  <w:abstractNum w:abstractNumId="66" w15:restartNumberingAfterBreak="0">
+  <w:abstractNum w:abstractNumId="67" w15:restartNumberingAfterBreak="0">
     <w:nsid w:val="64EC6FC0"/>
     <w:multiLevelType w:val="hybridMultilevel"/>
     <w:tmpl w:val="214CC6C4"/>
@@ -23565,7 +24226,7 @@
       </w:pPr>
     </w:lvl>
   </w:abstractNum>
-  <w:abstractNum w:abstractNumId="67" w15:restartNumberingAfterBreak="0">
+  <w:abstractNum w:abstractNumId="68" w15:restartNumberingAfterBreak="0">
     <w:nsid w:val="65466AFA"/>
     <w:multiLevelType w:val="hybridMultilevel"/>
     <w:tmpl w:val="214CC6C4"/>
@@ -23651,7 +24312,7 @@
       </w:pPr>
     </w:lvl>
   </w:abstractNum>
-  <w:abstractNum w:abstractNumId="68" w15:restartNumberingAfterBreak="0">
+  <w:abstractNum w:abstractNumId="69" w15:restartNumberingAfterBreak="0">
     <w:nsid w:val="65972C68"/>
     <w:multiLevelType w:val="hybridMultilevel"/>
     <w:tmpl w:val="214CC6C4"/>
@@ -23737,7 +24398,7 @@
       </w:pPr>
     </w:lvl>
   </w:abstractNum>
-  <w:abstractNum w:abstractNumId="69" w15:restartNumberingAfterBreak="0">
+  <w:abstractNum w:abstractNumId="70" w15:restartNumberingAfterBreak="0">
     <w:nsid w:val="68167485"/>
     <w:multiLevelType w:val="hybridMultilevel"/>
     <w:tmpl w:val="214CC6C4"/>
@@ -23823,7 +24484,7 @@
       </w:pPr>
     </w:lvl>
   </w:abstractNum>
-  <w:abstractNum w:abstractNumId="70" w15:restartNumberingAfterBreak="0">
+  <w:abstractNum w:abstractNumId="71" w15:restartNumberingAfterBreak="0">
     <w:nsid w:val="692A3DFA"/>
     <w:multiLevelType w:val="hybridMultilevel"/>
     <w:tmpl w:val="214CC6C4"/>
@@ -23909,7 +24570,7 @@
       </w:pPr>
     </w:lvl>
   </w:abstractNum>
-  <w:abstractNum w:abstractNumId="71" w15:restartNumberingAfterBreak="0">
+  <w:abstractNum w:abstractNumId="72" w15:restartNumberingAfterBreak="0">
     <w:nsid w:val="6AD95314"/>
     <w:multiLevelType w:val="hybridMultilevel"/>
     <w:tmpl w:val="214CC6C4"/>
@@ -23995,7 +24656,7 @@
       </w:pPr>
     </w:lvl>
   </w:abstractNum>
-  <w:abstractNum w:abstractNumId="72" w15:restartNumberingAfterBreak="0">
+  <w:abstractNum w:abstractNumId="73" w15:restartNumberingAfterBreak="0">
     <w:nsid w:val="6B085590"/>
     <w:multiLevelType w:val="hybridMultilevel"/>
     <w:tmpl w:val="214CC6C4"/>
@@ -24081,7 +24742,7 @@
       </w:pPr>
     </w:lvl>
   </w:abstractNum>
-  <w:abstractNum w:abstractNumId="73" w15:restartNumberingAfterBreak="0">
+  <w:abstractNum w:abstractNumId="74" w15:restartNumberingAfterBreak="0">
     <w:nsid w:val="6C802E67"/>
     <w:multiLevelType w:val="hybridMultilevel"/>
     <w:tmpl w:val="214CC6C4"/>
@@ -24167,7 +24828,7 @@
       </w:pPr>
     </w:lvl>
   </w:abstractNum>
-  <w:abstractNum w:abstractNumId="74" w15:restartNumberingAfterBreak="0">
+  <w:abstractNum w:abstractNumId="75" w15:restartNumberingAfterBreak="0">
     <w:nsid w:val="6EC96476"/>
     <w:multiLevelType w:val="hybridMultilevel"/>
     <w:tmpl w:val="3DFEBE78"/>
@@ -24253,7 +24914,7 @@
       </w:pPr>
     </w:lvl>
   </w:abstractNum>
-  <w:abstractNum w:abstractNumId="75" w15:restartNumberingAfterBreak="0">
+  <w:abstractNum w:abstractNumId="76" w15:restartNumberingAfterBreak="0">
     <w:nsid w:val="726B52C1"/>
     <w:multiLevelType w:val="hybridMultilevel"/>
     <w:tmpl w:val="214CC6C4"/>
@@ -24339,7 +25000,7 @@
       </w:pPr>
     </w:lvl>
   </w:abstractNum>
-  <w:abstractNum w:abstractNumId="76" w15:restartNumberingAfterBreak="0">
+  <w:abstractNum w:abstractNumId="77" w15:restartNumberingAfterBreak="0">
     <w:nsid w:val="728B0421"/>
     <w:multiLevelType w:val="hybridMultilevel"/>
     <w:tmpl w:val="214CC6C4"/>
@@ -24425,7 +25086,7 @@
       </w:pPr>
     </w:lvl>
   </w:abstractNum>
-  <w:abstractNum w:abstractNumId="77" w15:restartNumberingAfterBreak="0">
+  <w:abstractNum w:abstractNumId="78" w15:restartNumberingAfterBreak="0">
     <w:nsid w:val="73401E16"/>
     <w:multiLevelType w:val="hybridMultilevel"/>
     <w:tmpl w:val="214CC6C4"/>
@@ -24511,7 +25172,7 @@
       </w:pPr>
     </w:lvl>
   </w:abstractNum>
-  <w:abstractNum w:abstractNumId="78" w15:restartNumberingAfterBreak="0">
+  <w:abstractNum w:abstractNumId="79" w15:restartNumberingAfterBreak="0">
     <w:nsid w:val="75336A05"/>
     <w:multiLevelType w:val="hybridMultilevel"/>
     <w:tmpl w:val="214CC6C4"/>
@@ -24597,7 +25258,7 @@
       </w:pPr>
     </w:lvl>
   </w:abstractNum>
-  <w:abstractNum w:abstractNumId="79" w15:restartNumberingAfterBreak="0">
+  <w:abstractNum w:abstractNumId="80" w15:restartNumberingAfterBreak="0">
     <w:nsid w:val="779B3DB6"/>
     <w:multiLevelType w:val="hybridMultilevel"/>
     <w:tmpl w:val="214CC6C4"/>
@@ -24683,7 +25344,7 @@
       </w:pPr>
     </w:lvl>
   </w:abstractNum>
-  <w:abstractNum w:abstractNumId="80" w15:restartNumberingAfterBreak="0">
+  <w:abstractNum w:abstractNumId="81" w15:restartNumberingAfterBreak="0">
     <w:nsid w:val="7B23524C"/>
     <w:multiLevelType w:val="hybridMultilevel"/>
     <w:tmpl w:val="214CC6C4"/>
@@ -24769,7 +25430,7 @@
       </w:pPr>
     </w:lvl>
   </w:abstractNum>
-  <w:abstractNum w:abstractNumId="81" w15:restartNumberingAfterBreak="0">
+  <w:abstractNum w:abstractNumId="82" w15:restartNumberingAfterBreak="0">
     <w:nsid w:val="7B8572AA"/>
     <w:multiLevelType w:val="hybridMultilevel"/>
     <w:tmpl w:val="214CC6C4"/>
@@ -24855,7 +25516,7 @@
       </w:pPr>
     </w:lvl>
   </w:abstractNum>
-  <w:abstractNum w:abstractNumId="82" w15:restartNumberingAfterBreak="0">
+  <w:abstractNum w:abstractNumId="83" w15:restartNumberingAfterBreak="0">
     <w:nsid w:val="7BD85F1F"/>
     <w:multiLevelType w:val="hybridMultilevel"/>
     <w:tmpl w:val="214CC6C4"/>
@@ -24941,7 +25602,7 @@
       </w:pPr>
     </w:lvl>
   </w:abstractNum>
-  <w:abstractNum w:abstractNumId="83" w15:restartNumberingAfterBreak="0">
+  <w:abstractNum w:abstractNumId="84" w15:restartNumberingAfterBreak="0">
     <w:nsid w:val="7BE25365"/>
     <w:multiLevelType w:val="hybridMultilevel"/>
     <w:tmpl w:val="214CC6C4"/>
@@ -25028,28 +25689,28 @@
     </w:lvl>
   </w:abstractNum>
   <w:num w:numId="1" w16cid:durableId="689641893">
-    <w:abstractNumId w:val="41"/>
+    <w:abstractNumId w:val="42"/>
   </w:num>
   <w:num w:numId="2" w16cid:durableId="1714230517">
-    <w:abstractNumId w:val="58"/>
+    <w:abstractNumId w:val="59"/>
   </w:num>
   <w:num w:numId="3" w16cid:durableId="602418336">
-    <w:abstractNumId w:val="34"/>
+    <w:abstractNumId w:val="35"/>
   </w:num>
   <w:num w:numId="4" w16cid:durableId="319892333">
-    <w:abstractNumId w:val="63"/>
+    <w:abstractNumId w:val="64"/>
   </w:num>
   <w:num w:numId="5" w16cid:durableId="1682078939">
-    <w:abstractNumId w:val="69"/>
+    <w:abstractNumId w:val="70"/>
   </w:num>
   <w:num w:numId="6" w16cid:durableId="69352654">
-    <w:abstractNumId w:val="83"/>
+    <w:abstractNumId w:val="84"/>
   </w:num>
   <w:num w:numId="7" w16cid:durableId="399905843">
     <w:abstractNumId w:val="7"/>
   </w:num>
   <w:num w:numId="8" w16cid:durableId="1951157062">
-    <w:abstractNumId w:val="21"/>
+    <w:abstractNumId w:val="22"/>
   </w:num>
   <w:num w:numId="9" w16cid:durableId="646978431">
     <w:abstractNumId w:val="1"/>
@@ -25058,226 +25719,229 @@
     <w:abstractNumId w:val="5"/>
   </w:num>
   <w:num w:numId="11" w16cid:durableId="618218708">
-    <w:abstractNumId w:val="52"/>
+    <w:abstractNumId w:val="53"/>
   </w:num>
   <w:num w:numId="12" w16cid:durableId="1832019268">
-    <w:abstractNumId w:val="38"/>
+    <w:abstractNumId w:val="39"/>
   </w:num>
   <w:num w:numId="13" w16cid:durableId="2082213922">
-    <w:abstractNumId w:val="39"/>
+    <w:abstractNumId w:val="40"/>
   </w:num>
   <w:num w:numId="14" w16cid:durableId="1738477231">
-    <w:abstractNumId w:val="31"/>
+    <w:abstractNumId w:val="32"/>
   </w:num>
   <w:num w:numId="15" w16cid:durableId="1288660286">
-    <w:abstractNumId w:val="43"/>
+    <w:abstractNumId w:val="44"/>
   </w:num>
   <w:num w:numId="16" w16cid:durableId="1466973576">
-    <w:abstractNumId w:val="53"/>
+    <w:abstractNumId w:val="54"/>
   </w:num>
   <w:num w:numId="17" w16cid:durableId="1965962244">
-    <w:abstractNumId w:val="55"/>
+    <w:abstractNumId w:val="56"/>
   </w:num>
   <w:num w:numId="18" w16cid:durableId="857428966">
+    <w:abstractNumId w:val="58"/>
+  </w:num>
+  <w:num w:numId="19" w16cid:durableId="1102727235">
+    <w:abstractNumId w:val="82"/>
+  </w:num>
+  <w:num w:numId="20" w16cid:durableId="1825009635">
     <w:abstractNumId w:val="57"/>
   </w:num>
-  <w:num w:numId="19" w16cid:durableId="1102727235">
-    <w:abstractNumId w:val="81"/>
-  </w:num>
-  <w:num w:numId="20" w16cid:durableId="1825009635">
-    <w:abstractNumId w:val="56"/>
-  </w:num>
   <w:num w:numId="21" w16cid:durableId="1057817951">
-    <w:abstractNumId w:val="59"/>
+    <w:abstractNumId w:val="60"/>
   </w:num>
   <w:num w:numId="22" w16cid:durableId="1840851271">
-    <w:abstractNumId w:val="75"/>
+    <w:abstractNumId w:val="76"/>
   </w:num>
   <w:num w:numId="23" w16cid:durableId="31004759">
     <w:abstractNumId w:val="4"/>
   </w:num>
   <w:num w:numId="24" w16cid:durableId="196084434">
-    <w:abstractNumId w:val="45"/>
+    <w:abstractNumId w:val="46"/>
   </w:num>
   <w:num w:numId="25" w16cid:durableId="1765566772">
-    <w:abstractNumId w:val="22"/>
+    <w:abstractNumId w:val="23"/>
   </w:num>
   <w:num w:numId="26" w16cid:durableId="2051343699">
-    <w:abstractNumId w:val="18"/>
+    <w:abstractNumId w:val="19"/>
   </w:num>
   <w:num w:numId="27" w16cid:durableId="1356075474">
-    <w:abstractNumId w:val="12"/>
+    <w:abstractNumId w:val="13"/>
   </w:num>
   <w:num w:numId="28" w16cid:durableId="1531380620">
+    <w:abstractNumId w:val="78"/>
+  </w:num>
+  <w:num w:numId="29" w16cid:durableId="557712069">
     <w:abstractNumId w:val="77"/>
   </w:num>
-  <w:num w:numId="29" w16cid:durableId="557712069">
-    <w:abstractNumId w:val="76"/>
-  </w:num>
   <w:num w:numId="30" w16cid:durableId="1426002138">
-    <w:abstractNumId w:val="62"/>
+    <w:abstractNumId w:val="63"/>
   </w:num>
   <w:num w:numId="31" w16cid:durableId="1782995960">
-    <w:abstractNumId w:val="9"/>
+    <w:abstractNumId w:val="10"/>
   </w:num>
   <w:num w:numId="32" w16cid:durableId="760878363">
     <w:abstractNumId w:val="0"/>
   </w:num>
   <w:num w:numId="33" w16cid:durableId="1618559931">
-    <w:abstractNumId w:val="68"/>
+    <w:abstractNumId w:val="69"/>
   </w:num>
   <w:num w:numId="34" w16cid:durableId="1400901532">
-    <w:abstractNumId w:val="16"/>
+    <w:abstractNumId w:val="17"/>
   </w:num>
   <w:num w:numId="35" w16cid:durableId="1285959423">
-    <w:abstractNumId w:val="10"/>
+    <w:abstractNumId w:val="11"/>
   </w:num>
   <w:num w:numId="36" w16cid:durableId="741366976">
-    <w:abstractNumId w:val="8"/>
+    <w:abstractNumId w:val="9"/>
   </w:num>
   <w:num w:numId="37" w16cid:durableId="2038775239">
-    <w:abstractNumId w:val="25"/>
+    <w:abstractNumId w:val="26"/>
   </w:num>
   <w:num w:numId="38" w16cid:durableId="649556783">
+    <w:abstractNumId w:val="80"/>
+  </w:num>
+  <w:num w:numId="39" w16cid:durableId="1653750230">
+    <w:abstractNumId w:val="72"/>
+  </w:num>
+  <w:num w:numId="40" w16cid:durableId="938491575">
+    <w:abstractNumId w:val="61"/>
+  </w:num>
+  <w:num w:numId="41" w16cid:durableId="282228440">
+    <w:abstractNumId w:val="62"/>
+  </w:num>
+  <w:num w:numId="42" w16cid:durableId="1852640132">
+    <w:abstractNumId w:val="74"/>
+  </w:num>
+  <w:num w:numId="43" w16cid:durableId="1346899273">
+    <w:abstractNumId w:val="14"/>
+  </w:num>
+  <w:num w:numId="44" w16cid:durableId="209463670">
+    <w:abstractNumId w:val="37"/>
+  </w:num>
+  <w:num w:numId="45" w16cid:durableId="1180044402">
+    <w:abstractNumId w:val="73"/>
+  </w:num>
+  <w:num w:numId="46" w16cid:durableId="581186852">
+    <w:abstractNumId w:val="51"/>
+  </w:num>
+  <w:num w:numId="47" w16cid:durableId="114033196">
     <w:abstractNumId w:val="79"/>
   </w:num>
-  <w:num w:numId="39" w16cid:durableId="1653750230">
-    <w:abstractNumId w:val="71"/>
-  </w:num>
-  <w:num w:numId="40" w16cid:durableId="938491575">
-    <w:abstractNumId w:val="60"/>
-  </w:num>
-  <w:num w:numId="41" w16cid:durableId="282228440">
-    <w:abstractNumId w:val="61"/>
-  </w:num>
-  <w:num w:numId="42" w16cid:durableId="1852640132">
-    <w:abstractNumId w:val="73"/>
-  </w:num>
-  <w:num w:numId="43" w16cid:durableId="1346899273">
-    <w:abstractNumId w:val="13"/>
-  </w:num>
-  <w:num w:numId="44" w16cid:durableId="209463670">
-    <w:abstractNumId w:val="36"/>
-  </w:num>
-  <w:num w:numId="45" w16cid:durableId="1180044402">
-    <w:abstractNumId w:val="72"/>
-  </w:num>
-  <w:num w:numId="46" w16cid:durableId="581186852">
-    <w:abstractNumId w:val="50"/>
-  </w:num>
-  <w:num w:numId="47" w16cid:durableId="114033196">
-    <w:abstractNumId w:val="78"/>
-  </w:num>
   <w:num w:numId="48" w16cid:durableId="1500274313">
-    <w:abstractNumId w:val="23"/>
+    <w:abstractNumId w:val="24"/>
   </w:num>
   <w:num w:numId="49" w16cid:durableId="1362121190">
-    <w:abstractNumId w:val="17"/>
+    <w:abstractNumId w:val="18"/>
   </w:num>
   <w:num w:numId="50" w16cid:durableId="1031879328">
     <w:abstractNumId w:val="2"/>
   </w:num>
   <w:num w:numId="51" w16cid:durableId="71323068">
-    <w:abstractNumId w:val="44"/>
+    <w:abstractNumId w:val="45"/>
   </w:num>
   <w:num w:numId="52" w16cid:durableId="791824026">
-    <w:abstractNumId w:val="11"/>
+    <w:abstractNumId w:val="12"/>
   </w:num>
   <w:num w:numId="53" w16cid:durableId="1858884855">
+    <w:abstractNumId w:val="28"/>
+  </w:num>
+  <w:num w:numId="54" w16cid:durableId="743839652">
+    <w:abstractNumId w:val="15"/>
+  </w:num>
+  <w:num w:numId="55" w16cid:durableId="319189279">
+    <w:abstractNumId w:val="43"/>
+  </w:num>
+  <w:num w:numId="56" w16cid:durableId="1084959942">
+    <w:abstractNumId w:val="55"/>
+  </w:num>
+  <w:num w:numId="57" w16cid:durableId="551775919">
+    <w:abstractNumId w:val="16"/>
+  </w:num>
+  <w:num w:numId="58" w16cid:durableId="449978646">
+    <w:abstractNumId w:val="25"/>
+  </w:num>
+  <w:num w:numId="59" w16cid:durableId="147091717">
+    <w:abstractNumId w:val="36"/>
+  </w:num>
+  <w:num w:numId="60" w16cid:durableId="83651720">
+    <w:abstractNumId w:val="29"/>
+  </w:num>
+  <w:num w:numId="61" w16cid:durableId="669069174">
+    <w:abstractNumId w:val="31"/>
+  </w:num>
+  <w:num w:numId="62" w16cid:durableId="1481843890">
+    <w:abstractNumId w:val="68"/>
+  </w:num>
+  <w:num w:numId="63" w16cid:durableId="410079372">
+    <w:abstractNumId w:val="38"/>
+  </w:num>
+  <w:num w:numId="64" w16cid:durableId="811677477">
     <w:abstractNumId w:val="27"/>
   </w:num>
-  <w:num w:numId="54" w16cid:durableId="743839652">
-    <w:abstractNumId w:val="14"/>
+  <w:num w:numId="65" w16cid:durableId="817649347">
+    <w:abstractNumId w:val="41"/>
   </w:num>
-  <w:num w:numId="55" w16cid:durableId="319189279">
-    <w:abstractNumId w:val="42"/>
+  <w:num w:numId="66" w16cid:durableId="2128037891">
+    <w:abstractNumId w:val="49"/>
   </w:num>
-  <w:num w:numId="56" w16cid:durableId="1084959942">
-    <w:abstractNumId w:val="54"/>
+  <w:num w:numId="67" w16cid:durableId="1726219145">
+    <w:abstractNumId w:val="81"/>
   </w:num>
-  <w:num w:numId="57" w16cid:durableId="551775919">
-    <w:abstractNumId w:val="15"/>
+  <w:num w:numId="68" w16cid:durableId="1766615434">
+    <w:abstractNumId w:val="67"/>
   </w:num>
-  <w:num w:numId="58" w16cid:durableId="449978646">
-    <w:abstractNumId w:val="24"/>
-  </w:num>
-  <w:num w:numId="59" w16cid:durableId="147091717">
-    <w:abstractNumId w:val="35"/>
-  </w:num>
-  <w:num w:numId="60" w16cid:durableId="83651720">
-    <w:abstractNumId w:val="28"/>
-  </w:num>
-  <w:num w:numId="61" w16cid:durableId="669069174">
+  <w:num w:numId="69" w16cid:durableId="280234627">
     <w:abstractNumId w:val="30"/>
   </w:num>
-  <w:num w:numId="62" w16cid:durableId="1481843890">
-    <w:abstractNumId w:val="67"/>
-  </w:num>
-  <w:num w:numId="63" w16cid:durableId="410079372">
-    <w:abstractNumId w:val="37"/>
-  </w:num>
-  <w:num w:numId="64" w16cid:durableId="811677477">
-    <w:abstractNumId w:val="26"/>
-  </w:num>
-  <w:num w:numId="65" w16cid:durableId="817649347">
-    <w:abstractNumId w:val="40"/>
-  </w:num>
-  <w:num w:numId="66" w16cid:durableId="2128037891">
-    <w:abstractNumId w:val="48"/>
-  </w:num>
-  <w:num w:numId="67" w16cid:durableId="1726219145">
-    <w:abstractNumId w:val="80"/>
-  </w:num>
-  <w:num w:numId="68" w16cid:durableId="1766615434">
-    <w:abstractNumId w:val="66"/>
-  </w:num>
-  <w:num w:numId="69" w16cid:durableId="280234627">
-    <w:abstractNumId w:val="29"/>
-  </w:num>
   <w:num w:numId="70" w16cid:durableId="1207910607">
-    <w:abstractNumId w:val="64"/>
+    <w:abstractNumId w:val="65"/>
   </w:num>
   <w:num w:numId="71" w16cid:durableId="1640526067">
     <w:abstractNumId w:val="3"/>
   </w:num>
   <w:num w:numId="72" w16cid:durableId="1480685150">
-    <w:abstractNumId w:val="51"/>
+    <w:abstractNumId w:val="52"/>
   </w:num>
   <w:num w:numId="73" w16cid:durableId="1902905193">
-    <w:abstractNumId w:val="33"/>
+    <w:abstractNumId w:val="34"/>
   </w:num>
   <w:num w:numId="74" w16cid:durableId="1699814716">
-    <w:abstractNumId w:val="70"/>
+    <w:abstractNumId w:val="71"/>
   </w:num>
   <w:num w:numId="75" w16cid:durableId="1095246353">
-    <w:abstractNumId w:val="20"/>
+    <w:abstractNumId w:val="21"/>
   </w:num>
   <w:num w:numId="76" w16cid:durableId="1478064906">
-    <w:abstractNumId w:val="65"/>
+    <w:abstractNumId w:val="66"/>
   </w:num>
   <w:num w:numId="77" w16cid:durableId="153382077">
     <w:abstractNumId w:val="6"/>
   </w:num>
   <w:num w:numId="78" w16cid:durableId="1038506737">
-    <w:abstractNumId w:val="32"/>
+    <w:abstractNumId w:val="33"/>
   </w:num>
   <w:num w:numId="79" w16cid:durableId="370769239">
+    <w:abstractNumId w:val="48"/>
+  </w:num>
+  <w:num w:numId="80" w16cid:durableId="1923443751">
+    <w:abstractNumId w:val="83"/>
+  </w:num>
+  <w:num w:numId="81" w16cid:durableId="1046220979">
     <w:abstractNumId w:val="47"/>
   </w:num>
-  <w:num w:numId="80" w16cid:durableId="1923443751">
-    <w:abstractNumId w:val="82"/>
-  </w:num>
-  <w:num w:numId="81" w16cid:durableId="1046220979">
-    <w:abstractNumId w:val="46"/>
-  </w:num>
   <w:num w:numId="82" w16cid:durableId="1474832525">
-    <w:abstractNumId w:val="74"/>
+    <w:abstractNumId w:val="75"/>
   </w:num>
   <w:num w:numId="83" w16cid:durableId="1246305922">
-    <w:abstractNumId w:val="19"/>
+    <w:abstractNumId w:val="20"/>
   </w:num>
   <w:num w:numId="84" w16cid:durableId="769273119">
-    <w:abstractNumId w:val="49"/>
+    <w:abstractNumId w:val="50"/>
+  </w:num>
+  <w:num w:numId="85" w16cid:durableId="470291308">
+    <w:abstractNumId w:val="8"/>
   </w:num>
   <w:numIdMacAtCleanup w:val="82"/>
 </w:numbering>

</xml_diff>